<commit_message>
Update methods section with additional details and references for data sources
</commit_message>
<xml_diff>
--- a/Methods_text.docx
+++ b/Methods_text.docx
@@ -26,6 +26,63 @@
     <w:p>
       <w:pPr>
         <w:rPr>
+          <w:lang w:val="en-GB"/>
+        </w:rPr>
+      </w:pPr>
+      <w:r>
+        <w:rPr>
+          <w:lang w:val="en-GB"/>
+        </w:rPr>
+        <w:t xml:space="preserve">All subsequent analyses were carried out using Python v3.11.9 </w:t>
+      </w:r>
+      <w:r>
+        <w:rPr>
+          <w:lang w:val="en-GB"/>
+        </w:rPr>
+        <w:fldChar w:fldCharType="begin"/>
+      </w:r>
+      <w:r>
+        <w:rPr>
+          <w:lang w:val="en-GB"/>
+        </w:rPr>
+        <w:instrText xml:space="preserve"> ADDIN ZOTERO_ITEM CSL_CITATION {"citationID":"tz7brfoe","properties":{"unsorted":false,"formattedCitation":"(1)","plainCitation":"(1)","noteIndex":0},"citationItems":[{"id":44,"uris":["http://zotero.org/groups/6613661/items/KTJ8FZEX"],"itemData":{"id":44,"type":"software","abstract":"The official home of the Python Programming Language","publisher":"Python Software Foundation","title":"Python","URL":"https://www.python.org/","version":"3.11.9","author":[{"family":"Python Software Foundation","given":""}],"accessed":{"date-parts":[["2026",7,14]]},"issued":{"date-parts":[["2026"]]}}}],"schema":"https://github.com/citation-style-language/schema/raw/master/csl-citation.json"} </w:instrText>
+      </w:r>
+      <w:r>
+        <w:rPr>
+          <w:lang w:val="en-GB"/>
+        </w:rPr>
+        <w:fldChar w:fldCharType="separate"/>
+      </w:r>
+      <w:r>
+        <w:rPr>
+          <w:rFonts w:ascii="Aptos" w:hAnsi="Aptos"/>
+          <w:lang w:val="en-GB"/>
+        </w:rPr>
+        <w:t>(1)</w:t>
+      </w:r>
+      <w:r>
+        <w:rPr>
+          <w:lang w:val="en-GB"/>
+        </w:rPr>
+        <w:fldChar w:fldCharType="end"/>
+      </w:r>
+      <w:r>
+        <w:rPr>
+          <w:lang w:val="en-GB"/>
+        </w:rPr>
+        <w:t>.</w:t>
+      </w:r>
+    </w:p>
+    <w:p>
+      <w:pPr>
+        <w:rPr>
+          <w:lang w:val="en-GB"/>
+        </w:rPr>
+      </w:pPr>
+    </w:p>
+    <w:p>
+      <w:pPr>
+        <w:rPr>
           <w:b/>
           <w:bCs/>
           <w:sz w:val="28"/>
@@ -104,19 +161,86 @@
         <w:rPr>
           <w:lang w:val="en-GB"/>
         </w:rPr>
-        <w:t>. Local transmission rates for each investigated disease were retrieved from the ECDC Surveillance Atlas of Infectious Diseases (</w:t>
-      </w:r>
-      <w:r>
-        <w:rPr>
-          <w:lang w:val="en-GB"/>
-        </w:rPr>
-        <w:t>https://atlas.ecdc.europa.eu/public/index.aspx</w:t>
-      </w:r>
-      <w:r>
-        <w:rPr>
-          <w:lang w:val="en-GB"/>
-        </w:rPr>
-        <w:t>). No transmission rates for Usutu were available from the ECDC and were therefore excluded from the following analyses.</w:t>
+        <w:t>. Local transmission rates for each investigated disease were retrieved from the</w:t>
+      </w:r>
+      <w:r>
+        <w:rPr>
+          <w:lang w:val="en-GB"/>
+        </w:rPr>
+        <w:t xml:space="preserve"> European Centre for Disease Prevention and Control</w:t>
+      </w:r>
+      <w:r>
+        <w:rPr>
+          <w:lang w:val="en-GB"/>
+        </w:rPr>
+        <w:t xml:space="preserve"> </w:t>
+      </w:r>
+      <w:r>
+        <w:rPr>
+          <w:lang w:val="en-GB"/>
+        </w:rPr>
+        <w:t>(</w:t>
+      </w:r>
+      <w:r>
+        <w:rPr>
+          <w:lang w:val="en-GB"/>
+        </w:rPr>
+        <w:t>ECDC</w:t>
+      </w:r>
+      <w:r>
+        <w:rPr>
+          <w:lang w:val="en-GB"/>
+        </w:rPr>
+        <w:t>)</w:t>
+      </w:r>
+      <w:r>
+        <w:rPr>
+          <w:lang w:val="en-GB"/>
+        </w:rPr>
+        <w:t xml:space="preserve"> Surveillance Atlas of Infectious Diseases </w:t>
+      </w:r>
+      <w:r>
+        <w:rPr>
+          <w:lang w:val="en-GB"/>
+        </w:rPr>
+        <w:fldChar w:fldCharType="begin"/>
+      </w:r>
+      <w:r>
+        <w:rPr>
+          <w:lang w:val="en-GB"/>
+        </w:rPr>
+        <w:instrText xml:space="preserve"> ADDIN ZOTERO_ITEM CSL_CITATION {"citationID":"vDxZJTqy","properties":{"unsorted":false,"formattedCitation":"(2)","plainCitation":"(2)","noteIndex":0},"citationItems":[{"id":51,"uris":["http://zotero.org/groups/6613661/items/VH99N6DX"],"itemData":{"id":51,"type":"dataset","publisher-place":"Stockholm","title":"Surveillance Atlas of Infectious Diseases","URL":"https://atlas.ecdc.europa.eu/public/index.aspx","author":[{"family":"European Centre for Disease Prevention and Control (ECDC)","given":""}],"accessed":{"date-parts":[["2026",6,29]]}}}],"schema":"https://github.com/citation-style-language/schema/raw/master/csl-citation.json"} </w:instrText>
+      </w:r>
+      <w:r>
+        <w:rPr>
+          <w:lang w:val="en-GB"/>
+        </w:rPr>
+        <w:fldChar w:fldCharType="separate"/>
+      </w:r>
+      <w:r>
+        <w:rPr>
+          <w:rFonts w:ascii="Aptos" w:hAnsi="Aptos"/>
+          <w:lang w:val="en-GB"/>
+        </w:rPr>
+        <w:t>(2)</w:t>
+      </w:r>
+      <w:r>
+        <w:rPr>
+          <w:lang w:val="en-GB"/>
+        </w:rPr>
+        <w:fldChar w:fldCharType="end"/>
+      </w:r>
+      <w:r>
+        <w:rPr>
+          <w:lang w:val="en-GB"/>
+        </w:rPr>
+        <w:t xml:space="preserve">. </w:t>
+      </w:r>
+      <w:r>
+        <w:rPr>
+          <w:lang w:val="en-GB"/>
+        </w:rPr>
+        <w:t>No transmission rates for Usutu were available from the ECDC and were therefore excluded from the following analyses.</w:t>
       </w:r>
     </w:p>
     <w:p>
@@ -157,13 +281,110 @@
         <w:rPr>
           <w:lang w:val="en-GB"/>
         </w:rPr>
-        <w:t xml:space="preserve">The Google Trends API provides search data of Google search engine users. </w:t>
-      </w:r>
-      <w:r>
-        <w:rPr>
-          <w:lang w:val="en-GB"/>
-        </w:rPr>
-        <w:t>The trendspy v0.1.6 library was used to extract monthly Google Trends data from 01.01.2010 until 31.12.2015. To enable comparison across batches retrieving relative Google Trends data, an anchor word was included in each batch. Data was therefore normalised by dividing the keyword value by the anchor word value x 100. As an anchor word, the word “mosquito” was chosen in each country’s respective language (Germany, Austria and Switzerland: “Mücke”; Italy: “Zanzara”; Spain: “Mosquito”) since this word was general enough to guarantee non-zero search behaviour and specific enough to the analysis as not to dwarf keywords. For each country/category pairing, the mean of anchor-normalised values was calculated whereas for the anchor words, the original Google Trends values were preserved.</w:t>
+        <w:t xml:space="preserve">The </w:t>
+      </w:r>
+      <w:r>
+        <w:rPr>
+          <w:lang w:val="en-GB"/>
+        </w:rPr>
+        <w:t xml:space="preserve">Google Trends </w:t>
+      </w:r>
+      <w:r>
+        <w:rPr>
+          <w:lang w:val="en-GB"/>
+        </w:rPr>
+        <w:t xml:space="preserve">platform </w:t>
+      </w:r>
+      <w:r>
+        <w:rPr>
+          <w:lang w:val="en-GB"/>
+        </w:rPr>
+        <w:t xml:space="preserve">provides search data </w:t>
+      </w:r>
+      <w:r>
+        <w:rPr>
+          <w:lang w:val="en-GB"/>
+        </w:rPr>
+        <w:t>on</w:t>
+      </w:r>
+      <w:r>
+        <w:rPr>
+          <w:lang w:val="en-GB"/>
+        </w:rPr>
+        <w:t xml:space="preserve"> Google search engine users. </w:t>
+      </w:r>
+      <w:r>
+        <w:rPr>
+          <w:lang w:val="en-GB"/>
+        </w:rPr>
+        <w:t xml:space="preserve">The </w:t>
+      </w:r>
+      <w:r>
+        <w:rPr>
+          <w:lang w:val="en-GB"/>
+        </w:rPr>
+        <w:t>T</w:t>
+      </w:r>
+      <w:r>
+        <w:rPr>
+          <w:lang w:val="en-GB"/>
+        </w:rPr>
+        <w:t>rends</w:t>
+      </w:r>
+      <w:r>
+        <w:rPr>
+          <w:lang w:val="en-GB"/>
+        </w:rPr>
+        <w:t>P</w:t>
+      </w:r>
+      <w:r>
+        <w:rPr>
+          <w:lang w:val="en-GB"/>
+        </w:rPr>
+        <w:t xml:space="preserve">y v0.1.6 </w:t>
+      </w:r>
+      <w:r>
+        <w:rPr>
+          <w:lang w:val="en-GB"/>
+        </w:rPr>
+        <w:fldChar w:fldCharType="begin"/>
+      </w:r>
+      <w:r>
+        <w:rPr>
+          <w:lang w:val="en-GB"/>
+        </w:rPr>
+        <w:instrText xml:space="preserve"> ADDIN ZOTERO_ITEM CSL_CITATION {"citationID":"riK2YhOe","properties":{"unsorted":false,"formattedCitation":"(3)","plainCitation":"(3)","noteIndex":0},"citationItems":[{"id":53,"uris":["http://zotero.org/groups/6613661/items/5SUJ2EFC"],"itemData":{"id":53,"type":"software","abstract":"A Python library for accessing Google Trends data","genre":"Python","license":"MIT","note":"original-date: 2024-10-23T22:51:33Z","source":"GitHub","title":"sdil87/trendspy: v0.1.6","URL":"https://github.com/sdil87/trendspy/releases/tag/v0.1.6","version":"0.1.6","author":[{"family":"sdil87","given":""}],"accessed":{"date-parts":[["2026",7,14]]},"issued":{"date-parts":[["2024",12,25]]}}}],"schema":"https://github.com/citation-style-language/schema/raw/master/csl-citation.json"} </w:instrText>
+      </w:r>
+      <w:r>
+        <w:rPr>
+          <w:lang w:val="en-GB"/>
+        </w:rPr>
+        <w:fldChar w:fldCharType="separate"/>
+      </w:r>
+      <w:r>
+        <w:rPr>
+          <w:rFonts w:ascii="Aptos" w:hAnsi="Aptos"/>
+          <w:lang w:val="en-GB"/>
+        </w:rPr>
+        <w:t>(3)</w:t>
+      </w:r>
+      <w:r>
+        <w:rPr>
+          <w:lang w:val="en-GB"/>
+        </w:rPr>
+        <w:fldChar w:fldCharType="end"/>
+      </w:r>
+      <w:r>
+        <w:rPr>
+          <w:lang w:val="en-GB"/>
+        </w:rPr>
+        <w:t xml:space="preserve"> </w:t>
+      </w:r>
+      <w:r>
+        <w:rPr>
+          <w:lang w:val="en-GB"/>
+        </w:rPr>
+        <w:t>library was used to extract monthly Google Trends data from 01.01.2010 until 31.12.2015. To enable comparison across batches retrieving relative Google Trends data, an anchor word was included in each batch. Data was therefore normalised by dividing the keyword value by the anchor word value x 100. As an anchor word, the word “mosquito” was chosen in each country’s respective language (Germany, Austria and Switzerland: “Mücke”; Italy: “Zanzara”; Spain: “Mosquito”) since this word was general enough to guarantee non-zero search behaviour and specific enough to the analysis as not to dwarf keywords. For each country/category pairing, the mean of anchor-normalised values was calculated whereas for the anchor words, the original Google Trends values were preserved.</w:t>
       </w:r>
     </w:p>
     <w:p>
@@ -210,7 +431,141 @@
         <w:rPr>
           <w:lang w:val="en-GB"/>
         </w:rPr>
-        <w:t>Each keyword was mapped to a QID within Wiki Pageviews’ identification system. Therefore, every country was assigned the same QIDs. Since per country breakdown data is only available from Wiki Pageviews since 2023, for the purposes of this analysis a major language domain approach was chosen. Hence, access data was only retrieved for German Wikipedia articles (</w:t>
+        <w:t xml:space="preserve">Each keyword was mapped to a QID </w:t>
+      </w:r>
+      <w:r>
+        <w:rPr>
+          <w:lang w:val="en-GB"/>
+        </w:rPr>
+        <w:t>within</w:t>
+      </w:r>
+      <w:r>
+        <w:rPr>
+          <w:lang w:val="en-GB"/>
+        </w:rPr>
+        <w:t xml:space="preserve"> the Wikidata database </w:t>
+      </w:r>
+      <w:r>
+        <w:rPr>
+          <w:lang w:val="en-GB"/>
+        </w:rPr>
+        <w:fldChar w:fldCharType="begin"/>
+      </w:r>
+      <w:r>
+        <w:rPr>
+          <w:lang w:val="en-GB"/>
+        </w:rPr>
+        <w:instrText xml:space="preserve"> ADDIN ZOTERO_ITEM CSL_CITATION {"citationID":"AG1PsRbJ","properties":{"unsorted":false,"formattedCitation":"(4)","plainCitation":"(4)","noteIndex":0},"citationItems":[{"id":48,"uris":["http://zotero.org/groups/6613661/items/NV2SMBG4"],"itemData":{"id":48,"type":"webpage","title":"Wikidata","URL":"https://www.wikidata.org/","author":[{"family":"Wikimedia Foundation","given":""}],"accessed":{"date-parts":[["2026",7,14]]},"issued":{"date-parts":[["2026",6,19]]}}}],"schema":"https://github.com/citation-style-language/schema/raw/master/csl-citation.json"} </w:instrText>
+      </w:r>
+      <w:r>
+        <w:rPr>
+          <w:lang w:val="en-GB"/>
+        </w:rPr>
+        <w:fldChar w:fldCharType="separate"/>
+      </w:r>
+      <w:r>
+        <w:rPr>
+          <w:rFonts w:ascii="Aptos" w:hAnsi="Aptos"/>
+          <w:lang w:val="en-GB"/>
+        </w:rPr>
+        <w:t>(4)</w:t>
+      </w:r>
+      <w:r>
+        <w:rPr>
+          <w:lang w:val="en-GB"/>
+        </w:rPr>
+        <w:fldChar w:fldCharType="end"/>
+      </w:r>
+      <w:r>
+        <w:rPr>
+          <w:lang w:val="en-GB"/>
+        </w:rPr>
+        <w:t xml:space="preserve">. </w:t>
+      </w:r>
+      <w:r>
+        <w:rPr>
+          <w:lang w:val="en-GB"/>
+        </w:rPr>
+        <w:t>Since QIDs are assigned</w:t>
+      </w:r>
+      <w:r>
+        <w:rPr>
+          <w:lang w:val="en-GB"/>
+        </w:rPr>
+        <w:t xml:space="preserve"> to Wikipedia entries</w:t>
+      </w:r>
+      <w:r>
+        <w:rPr>
+          <w:lang w:val="en-GB"/>
+        </w:rPr>
+        <w:t xml:space="preserve"> irrespective of language,</w:t>
+      </w:r>
+      <w:r>
+        <w:rPr>
+          <w:lang w:val="en-GB"/>
+        </w:rPr>
+        <w:t xml:space="preserve"> every country was assigned the same QIDs. Since per country breakdown data is only available from </w:t>
+      </w:r>
+      <w:r>
+        <w:rPr>
+          <w:lang w:val="en-GB"/>
+        </w:rPr>
+        <w:t xml:space="preserve">the </w:t>
+      </w:r>
+      <w:r>
+        <w:rPr>
+          <w:lang w:val="en-GB"/>
+        </w:rPr>
+        <w:t>Wiki</w:t>
+      </w:r>
+      <w:r>
+        <w:rPr>
+          <w:lang w:val="en-GB"/>
+        </w:rPr>
+        <w:t xml:space="preserve">media Analytics API </w:t>
+      </w:r>
+      <w:r>
+        <w:rPr>
+          <w:lang w:val="en-GB"/>
+        </w:rPr>
+        <w:fldChar w:fldCharType="begin"/>
+      </w:r>
+      <w:r>
+        <w:rPr>
+          <w:lang w:val="en-GB"/>
+        </w:rPr>
+        <w:instrText xml:space="preserve"> ADDIN ZOTERO_ITEM CSL_CITATION {"citationID":"l2YvbS2Y","properties":{"unsorted":false,"formattedCitation":"(5)","plainCitation":"(5)","noteIndex":0},"citationItems":[{"id":46,"uris":["http://zotero.org/groups/6613661/items/I3TIWJJE"],"itemData":{"id":46,"type":"webpage","title":"Wikimedia Analytics API","URL":"https://doc.wikimedia.org/generated-data-platform/aqs/analytics-api/","author":[{"family":"Wikimedia Foundation","given":""}],"accessed":{"date-parts":[["2026",7,14]]},"issued":{"date-parts":[["2026",6,22]]}}}],"schema":"https://github.com/citation-style-language/schema/raw/master/csl-citation.json"} </w:instrText>
+      </w:r>
+      <w:r>
+        <w:rPr>
+          <w:lang w:val="en-GB"/>
+        </w:rPr>
+        <w:fldChar w:fldCharType="separate"/>
+      </w:r>
+      <w:r>
+        <w:rPr>
+          <w:rFonts w:ascii="Aptos" w:hAnsi="Aptos"/>
+          <w:lang w:val="en-GB"/>
+        </w:rPr>
+        <w:t>(5)</w:t>
+      </w:r>
+      <w:r>
+        <w:rPr>
+          <w:lang w:val="en-GB"/>
+        </w:rPr>
+        <w:fldChar w:fldCharType="end"/>
+      </w:r>
+      <w:r>
+        <w:rPr>
+          <w:lang w:val="en-GB"/>
+        </w:rPr>
+        <w:t xml:space="preserve"> </w:t>
+      </w:r>
+      <w:r>
+        <w:rPr>
+          <w:lang w:val="en-GB"/>
+        </w:rPr>
+        <w:t>since 2023, for the purposes of this analysis a major language domain approach was chosen. Hence, access data was only retrieved for German Wikipedia articles (</w:t>
       </w:r>
       <w:r>
         <w:rPr>
@@ -294,7 +649,14 @@
         <w:rPr>
           <w:lang w:val="en-GB"/>
         </w:rPr>
-        <w:t xml:space="preserve"> unavailable. To allow for comparison of search behaviour across languages, keyword data was normalised against total monthly Wiki Pageviews of each language domain. The same normalisation step was executed for the anchor words outlined above. Since all countries were represented by the same number of QIDs, normalised values were summed across category/country pairs.</w:t>
+        <w:t xml:space="preserve"> unavailable. To allow for comparison of search behaviour across languages, keyword data was normalised against total </w:t>
+      </w:r>
+      <w:r>
+        <w:rPr>
+          <w:lang w:val="en-GB"/>
+        </w:rPr>
+        <w:lastRenderedPageBreak/>
+        <w:t>monthly Wiki Pageviews of each language domain. The same normalisation step was executed for the anchor words outlined above. Since all countries were represented by the same number of QIDs, normalised values were summed across category/country pairs.</w:t>
       </w:r>
     </w:p>
     <w:p>
@@ -322,55 +684,9 @@
           <w:szCs w:val="28"/>
           <w:lang w:val="en-GB"/>
         </w:rPr>
-        <w:t>Mediacloud</w:t>
-      </w:r>
-    </w:p>
-    <w:p>
-      <w:pPr>
-        <w:rPr>
-          <w:lang w:val="en-GB"/>
-        </w:rPr>
-      </w:pPr>
-      <w:r>
-        <w:rPr>
-          <w:lang w:val="en-GB"/>
-        </w:rPr>
-        <w:t xml:space="preserve">Mediacloud is a platform that hosts country-specific collections of online news articles combined with a search engine feature. </w:t>
-      </w:r>
-      <w:r>
-        <w:rPr>
-          <w:lang w:val="en-GB"/>
-        </w:rPr>
-        <w:t xml:space="preserve">Keywords belonging to a category were combined into a </w:t>
-      </w:r>
-      <w:r>
-        <w:rPr>
-          <w:lang w:val="en-GB"/>
-        </w:rPr>
-        <w:t xml:space="preserve">single </w:t>
-      </w:r>
-      <w:r>
-        <w:rPr>
-          <w:lang w:val="en-GB"/>
-        </w:rPr>
-        <w:t xml:space="preserve">Solr query string. For each country, the National and State &amp; Local collections were used as search databases. </w:t>
-      </w:r>
-      <w:r>
-        <w:rPr>
-          <w:lang w:val="en-GB"/>
-        </w:rPr>
-        <w:t>The number of monthly articles published between 01.01.2010 and 31.12.2025 was retrieved for each category and for the respective anchor word. This data was normalised against the number of all news stories held in the queried collections per country x 100.</w:t>
-      </w:r>
-    </w:p>
-    <w:p>
-      <w:pPr>
-        <w:rPr>
-          <w:lang w:val="en-GB"/>
-        </w:rPr>
-      </w:pPr>
-    </w:p>
-    <w:p>
-      <w:pPr>
+        <w:t>Media</w:t>
+      </w:r>
+      <w:r>
         <w:rPr>
           <w:b/>
           <w:bCs/>
@@ -378,7 +694,8 @@
           <w:szCs w:val="28"/>
           <w:lang w:val="en-GB"/>
         </w:rPr>
-      </w:pPr>
+        <w:t xml:space="preserve"> C</w:t>
+      </w:r>
       <w:r>
         <w:rPr>
           <w:b/>
@@ -387,158 +704,154 @@
           <w:szCs w:val="28"/>
           <w:lang w:val="en-GB"/>
         </w:rPr>
-        <w:t>Plotting</w:t>
-      </w:r>
-    </w:p>
-    <w:p>
-      <w:pPr>
-        <w:rPr>
-          <w:lang w:val="en-GB"/>
-        </w:rPr>
-      </w:pPr>
-      <w:r>
-        <w:rPr>
-          <w:lang w:val="en-GB"/>
-        </w:rPr>
-        <w:t xml:space="preserve">Normalised Google Trends, Wiki Pageviews, and Mediacloud data was </w:t>
-      </w:r>
-      <w:r>
-        <w:rPr>
-          <w:lang w:val="en-GB"/>
-        </w:rPr>
-        <w:t xml:space="preserve">separately </w:t>
-      </w:r>
-      <w:r>
-        <w:rPr>
-          <w:lang w:val="en-GB"/>
-        </w:rPr>
-        <w:t xml:space="preserve">averaged across months and years for each country and category. Monthly and yearly averages were plotted using a smoothed trendline estimated with </w:t>
-      </w:r>
-      <w:r>
-        <w:rPr>
-          <w:lang w:val="en-GB"/>
-        </w:rPr>
-        <w:t xml:space="preserve">a </w:t>
-      </w:r>
-      <w:r>
-        <w:rPr>
-          <w:lang w:val="en-GB"/>
-        </w:rPr>
-        <w:t>generali</w:t>
-      </w:r>
-      <w:r>
-        <w:rPr>
-          <w:lang w:val="en-GB"/>
-        </w:rPr>
-        <w:t>s</w:t>
-      </w:r>
-      <w:r>
-        <w:rPr>
-          <w:lang w:val="en-GB"/>
-        </w:rPr>
-        <w:t>ed additive model (GAM) implemented in pygam v0.12.0.</w:t>
-      </w:r>
-      <w:r>
-        <w:rPr>
-          <w:lang w:val="en-GB"/>
-        </w:rPr>
-        <w:t xml:space="preserve"> For plots depicting yearly averages, a </w:t>
-      </w:r>
-      <w:r>
-        <w:rPr>
-          <w:lang w:val="en-GB"/>
-        </w:rPr>
-        <w:t>single</w:t>
-      </w:r>
-      <w:r>
-        <w:rPr>
-          <w:lang w:val="en-GB"/>
-        </w:rPr>
-        <w:t xml:space="preserve"> penalised B-spline term was fitted to the time variable </w:t>
-      </w:r>
-      <w:r>
-        <w:rPr>
-          <w:lang w:val="en-GB"/>
-        </w:rPr>
-        <w:t>(s(0), pygam default basis dimension).</w:t>
-      </w:r>
-      <w:r>
-        <w:rPr>
-          <w:lang w:val="en-GB"/>
-        </w:rPr>
-        <w:t xml:space="preserve"> For plots depicting monthly averages to acknowledge seasonal connectivity between months, an additive model with two penalised B-spline terms </w:t>
-      </w:r>
-      <w:r>
-        <w:rPr>
-          <w:lang w:val="en-GB"/>
-        </w:rPr>
-        <w:t>on sine- and cosine-transformed month-of-year was used (s(0) + s(1), pygam default basis dimension)</w:t>
-      </w:r>
-      <w:r>
-        <w:rPr>
-          <w:lang w:val="en-GB"/>
-        </w:rPr>
-        <w:t xml:space="preserve">. </w:t>
-      </w:r>
-      <w:r>
-        <w:rPr>
-          <w:lang w:val="en-GB"/>
-        </w:rPr>
-        <w:t xml:space="preserve">Predictions were generated over a grid of 200 points spanning either the twelve months of the year or the observed year range, together with 95% confidence intervals reflecting uncertainty in the estimated trend. </w:t>
-      </w:r>
-      <w:r>
-        <w:rPr>
-          <w:lang w:val="en-GB"/>
-        </w:rPr>
-        <w:t>For disease plots with</w:t>
-      </w:r>
-      <w:r>
-        <w:rPr>
-          <w:lang w:val="en-GB"/>
-        </w:rPr>
-        <w:t xml:space="preserve"> corresponding ECDC transmission data (Dengue, Chikungunya, West Nile, Zika), the </w:t>
-      </w:r>
-      <w:r>
-        <w:rPr>
-          <w:lang w:val="en-GB"/>
-        </w:rPr>
-        <w:t xml:space="preserve">points in time with the </w:t>
-      </w:r>
-      <w:r>
-        <w:rPr>
-          <w:lang w:val="en-GB"/>
-        </w:rPr>
-        <w:t xml:space="preserve">first non-zero reported case count, and the </w:t>
-      </w:r>
-      <w:r>
-        <w:rPr>
-          <w:lang w:val="en-GB"/>
-        </w:rPr>
-        <w:t>maximum</w:t>
-      </w:r>
-      <w:r>
-        <w:rPr>
-          <w:lang w:val="en-GB"/>
-        </w:rPr>
-        <w:t xml:space="preserve"> reported cases </w:t>
-      </w:r>
-      <w:r>
-        <w:rPr>
-          <w:lang w:val="en-GB"/>
-        </w:rPr>
-        <w:t xml:space="preserve">were </w:t>
-      </w:r>
-      <w:r>
-        <w:rPr>
-          <w:lang w:val="en-GB"/>
-        </w:rPr>
-        <w:t>indicated on the x-axes</w:t>
-      </w:r>
-      <w:r>
-        <w:rPr>
-          <w:lang w:val="en-GB"/>
-        </w:rPr>
-        <w:t>.</w:t>
+        <w:t>loud</w:t>
+      </w:r>
+    </w:p>
+    <w:p>
+      <w:pPr>
+        <w:rPr>
+          <w:lang w:val="en-GB"/>
+        </w:rPr>
+      </w:pPr>
+      <w:r>
+        <w:rPr>
+          <w:lang w:val="en-GB"/>
+        </w:rPr>
+        <w:t>Media</w:t>
+      </w:r>
+      <w:r>
+        <w:rPr>
+          <w:lang w:val="en-GB"/>
+        </w:rPr>
+        <w:t xml:space="preserve"> C</w:t>
+      </w:r>
+      <w:r>
+        <w:rPr>
+          <w:lang w:val="en-GB"/>
+        </w:rPr>
+        <w:t>loud</w:t>
+      </w:r>
+      <w:r>
+        <w:rPr>
+          <w:lang w:val="en-GB"/>
+        </w:rPr>
+        <w:t xml:space="preserve"> </w:t>
+      </w:r>
+      <w:r>
+        <w:rPr>
+          <w:lang w:val="en-GB"/>
+        </w:rPr>
+        <w:fldChar w:fldCharType="begin"/>
+      </w:r>
+      <w:r>
+        <w:rPr>
+          <w:lang w:val="en-GB"/>
+        </w:rPr>
+        <w:instrText xml:space="preserve"> ADDIN ZOTERO_ITEM CSL_CITATION {"citationID":"LQNu6j1J","properties":{"unsorted":false,"formattedCitation":"(6)","plainCitation":"(6)","noteIndex":0},"citationItems":[{"id":34,"uris":["http://zotero.org/groups/6613661/items/8HRQ9PWR"],"itemData":{"id":34,"type":"article-journal","abstract":"We present the first full description of Media Cloud, an open source platform based on crawling hyperlink structure in operation for over 10 years, that for many uses will be the best way to collect data for studying the media ecosystem on the open web. We document the key choices behind what data Media Cloud collects and stores, how it processes and organizes these data, and its open API access as well as user-facing tools. We also highlight the strengths and limitations of the Media Cloud collection strategy compared to relevant alternatives. We give an overview two sample datasets generated using Media Cloud and discuss how researchers can use the platform to create their own datasets.","container-title":"Proceedings of the International AAAI Conference on Web and Social Media","DOI":"10.1609/icwsm.v15i1.18127","ISSN":"2334-0770, 2162-3449","journalAbbreviation":"ICWSM","page":"1034-1045","source":"DOI.org (Crossref)","title":"Media Cloud: Massive Open Source Collection of Global News on the Open Web","title-short":"Media Cloud","volume":"15","author":[{"family":"Roberts","given":"Hal"},{"family":"Bhargava","given":"Rahul"},{"family":"Valiukas","given":"Linas"},{"family":"Jen","given":"Dennis"},{"family":"Malik","given":"Momin M."},{"family":"Bishop","given":"Cindy Sherman"},{"family":"Ndulue","given":"Emily B."},{"family":"Dave","given":"Aashka"},{"family":"Clark","given":"Justin"},{"family":"Etling","given":"Bruce"},{"family":"Faris","given":"Robert"},{"family":"Shah","given":"Anushka"},{"family":"Rubinovitz","given":"Jasmin"},{"family":"Hope","given":"Alexis"},{"family":"D'Ignazio","given":"Catherine"},{"family":"Bermejo","given":"Fernando"},{"family":"Benkler","given":"Yochai"},{"family":"Zuckerman","given":"Ethan"}],"issued":{"date-parts":[["2021",5,22]]}}}],"schema":"https://github.com/citation-style-language/schema/raw/master/csl-citation.json"} </w:instrText>
+      </w:r>
+      <w:r>
+        <w:rPr>
+          <w:lang w:val="en-GB"/>
+        </w:rPr>
+        <w:fldChar w:fldCharType="separate"/>
+      </w:r>
+      <w:r>
+        <w:rPr>
+          <w:rFonts w:ascii="Aptos" w:hAnsi="Aptos"/>
+          <w:lang w:val="en-GB"/>
+        </w:rPr>
+        <w:t>(6)</w:t>
+      </w:r>
+      <w:r>
+        <w:rPr>
+          <w:lang w:val="en-GB"/>
+        </w:rPr>
+        <w:fldChar w:fldCharType="end"/>
+      </w:r>
+      <w:r>
+        <w:rPr>
+          <w:lang w:val="en-GB"/>
+        </w:rPr>
+        <w:t xml:space="preserve"> is a platform that hosts country-specific collections of online news articles combined with a search engine feature. </w:t>
+      </w:r>
+      <w:r>
+        <w:rPr>
+          <w:lang w:val="en-GB"/>
+        </w:rPr>
+        <w:t xml:space="preserve">Keywords belonging to a category were combined into a </w:t>
+      </w:r>
+      <w:r>
+        <w:rPr>
+          <w:lang w:val="en-GB"/>
+        </w:rPr>
+        <w:t xml:space="preserve">single </w:t>
+      </w:r>
+      <w:r>
+        <w:rPr>
+          <w:lang w:val="en-GB"/>
+        </w:rPr>
+        <w:t xml:space="preserve">Solr query string. For each country, the National and State &amp; Local collections were used as search databases. </w:t>
+      </w:r>
+      <w:r>
+        <w:rPr>
+          <w:lang w:val="en-GB"/>
+        </w:rPr>
+        <w:t>The number of monthly articles published between 01.01.2010 and 31.12.2025 was retrieved for each category and</w:t>
+      </w:r>
+      <w:r>
+        <w:rPr>
+          <w:lang w:val="en-GB"/>
+        </w:rPr>
+        <w:t xml:space="preserve"> </w:t>
+      </w:r>
+      <w:r>
+        <w:rPr>
+          <w:lang w:val="en-GB"/>
+        </w:rPr>
+        <w:t>anchor word</w:t>
+      </w:r>
+      <w:r>
+        <w:rPr>
+          <w:lang w:val="en-GB"/>
+        </w:rPr>
+        <w:t xml:space="preserve"> using the MediaCloud Python API Client v5.1.0 </w:t>
+      </w:r>
+      <w:r>
+        <w:rPr>
+          <w:lang w:val="en-GB"/>
+        </w:rPr>
+        <w:fldChar w:fldCharType="begin"/>
+      </w:r>
+      <w:r>
+        <w:rPr>
+          <w:lang w:val="en-GB"/>
+        </w:rPr>
+        <w:instrText xml:space="preserve"> ADDIN ZOTERO_ITEM CSL_CITATION {"citationID":"kGfwzhV3","properties":{"unsorted":false,"formattedCitation":"(7)","plainCitation":"(7)","noteIndex":0},"citationItems":[{"id":50,"uris":["http://zotero.org/groups/6613661/items/JTTZV2FN"],"itemData":{"id":50,"type":"software","abstract":"Public client for consuming content from the Media Cloud Online News Archive &amp; Directory.","genre":"Python","license":"Apache-2.0","note":"original-date: 2012-09-21T19:04:38Z","publisher":"Media Cloud","source":"GitHub","title":"MediaCloud Python API Client","URL":"https://github.com/mediacloud/api-client/releases/tag/v5.1.0","version":"5.1.0","author":[{"family":"MediaCloud","given":""}],"accessed":{"date-parts":[["2026",7,14]]},"issued":{"date-parts":[["2026",6,23]]}}}],"schema":"https://github.com/citation-style-language/schema/raw/master/csl-citation.json"} </w:instrText>
+      </w:r>
+      <w:r>
+        <w:rPr>
+          <w:lang w:val="en-GB"/>
+        </w:rPr>
+        <w:fldChar w:fldCharType="separate"/>
+      </w:r>
+      <w:r>
+        <w:rPr>
+          <w:rFonts w:ascii="Aptos" w:hAnsi="Aptos"/>
+          <w:lang w:val="en-GB"/>
+        </w:rPr>
+        <w:t>(7)</w:t>
+      </w:r>
+      <w:r>
+        <w:rPr>
+          <w:lang w:val="en-GB"/>
+        </w:rPr>
+        <w:fldChar w:fldCharType="end"/>
+      </w:r>
+      <w:r>
+        <w:rPr>
+          <w:lang w:val="en-GB"/>
+        </w:rPr>
+        <w:t>. This data was normalised against the number of all news stories held in the queried collections per country x 100.</w:t>
       </w:r>
     </w:p>
     <w:p>
@@ -566,6 +879,276 @@
           <w:szCs w:val="28"/>
           <w:lang w:val="en-GB"/>
         </w:rPr>
+        <w:t>Plotting</w:t>
+      </w:r>
+    </w:p>
+    <w:p>
+      <w:pPr>
+        <w:rPr>
+          <w:lang w:val="en-GB"/>
+        </w:rPr>
+      </w:pPr>
+      <w:r>
+        <w:rPr>
+          <w:lang w:val="en-GB"/>
+        </w:rPr>
+        <w:t>Normalised Google Trends, Wiki Pageviews, and Media</w:t>
+      </w:r>
+      <w:r>
+        <w:rPr>
+          <w:lang w:val="en-GB"/>
+        </w:rPr>
+        <w:t xml:space="preserve"> C</w:t>
+      </w:r>
+      <w:r>
+        <w:rPr>
+          <w:lang w:val="en-GB"/>
+        </w:rPr>
+        <w:t xml:space="preserve">loud data was </w:t>
+      </w:r>
+      <w:r>
+        <w:rPr>
+          <w:lang w:val="en-GB"/>
+        </w:rPr>
+        <w:t xml:space="preserve">separately </w:t>
+      </w:r>
+      <w:r>
+        <w:rPr>
+          <w:lang w:val="en-GB"/>
+        </w:rPr>
+        <w:t xml:space="preserve">averaged across months and years for each country and category. Monthly and yearly averages were plotted using a smoothed trendline estimated with </w:t>
+      </w:r>
+      <w:r>
+        <w:rPr>
+          <w:lang w:val="en-GB"/>
+        </w:rPr>
+        <w:t xml:space="preserve">a </w:t>
+      </w:r>
+      <w:r>
+        <w:rPr>
+          <w:lang w:val="en-GB"/>
+        </w:rPr>
+        <w:t>generali</w:t>
+      </w:r>
+      <w:r>
+        <w:rPr>
+          <w:lang w:val="en-GB"/>
+        </w:rPr>
+        <w:t>s</w:t>
+      </w:r>
+      <w:r>
+        <w:rPr>
+          <w:lang w:val="en-GB"/>
+        </w:rPr>
+        <w:t>ed additive model (GAM) implemented in py</w:t>
+      </w:r>
+      <w:r>
+        <w:rPr>
+          <w:lang w:val="en-GB"/>
+        </w:rPr>
+        <w:t>GAM</w:t>
+      </w:r>
+      <w:r>
+        <w:rPr>
+          <w:lang w:val="en-GB"/>
+        </w:rPr>
+        <w:t xml:space="preserve"> v0.12.0</w:t>
+      </w:r>
+      <w:r>
+        <w:rPr>
+          <w:lang w:val="en-GB"/>
+        </w:rPr>
+        <w:t xml:space="preserve"> </w:t>
+      </w:r>
+      <w:r>
+        <w:rPr>
+          <w:lang w:val="en-GB"/>
+        </w:rPr>
+        <w:fldChar w:fldCharType="begin"/>
+      </w:r>
+      <w:r>
+        <w:rPr>
+          <w:lang w:val="en-GB"/>
+        </w:rPr>
+        <w:instrText xml:space="preserve"> ADDIN ZOTERO_ITEM CSL_CITATION {"citationID":"AXE0UoR2","properties":{"unsorted":false,"formattedCitation":"(8)","plainCitation":"(8)","noteIndex":0},"citationItems":[{"id":33,"uris":["http://zotero.org/groups/6613661/items/9DIYTYZ5"],"itemData":{"id":33,"type":"software","abstract":"What's Changed\n\nBug Fixes\n\n\n\n\n[BUG] fix bug where parameter callbacks is not set in LinearGAM constructor by @deniseschmitz42 in https://github.com/dswah/pyGAM/pull/359\n\n\n\n[BUG] modify order of param validation in gridsearch by @dswah in https://github.com/dswah/pyGAM/pull/251\n\n\n\n[BUG] fix incorrect scale parameter in Distribution by @dswah in https://github.com/dswah/pyGAM/pull/404\n\n\n\n[BUG] Fix error with data ownership in cholesky by @craymichael in https://github.com/dswah/pyGAM/pull/288\n\n\n\n[BUG] remove dense zeros by @dswah in https://github.com/dswah/pyGAM/pull/414\n\n\n\n[BUG] truncate SVD by @dswah in https://github.com/dswah/pyGAM/pull/417\n\n\n\n[BUG] Sparse array by @jonathan-taylor in https://github.com/dswah/pyGAM/pull/373\n\n\n\nDocs\n\n\n\n[DOC] Update the stringdoc of FactorTerm in terms.py by @nicoleta-kyo in https://github.com/dswah/pyGAM/pull/286\n\n\n\n[DOC] Update version number to 0.11.0 in README by @fkiraly in https://github.com/dswah/pyGAM/pull/407\n\n\n\n[DOC] Fix Documentation Builds by @dswah in https://github.com/dswah/pyGAM/pull/405\n\n\n\n[DOC] Fixed docstring of GAM classes - index of intercept estimate by @utopianf in https://github.com/dswah/pyGAM/pull/324\n\n\n\n[DOC] corrections to pygam.py docstrings by @deniseschmitz42 in https://github.com/dswah/pyGAM/pull/361\n\n\n\n[DOC] Use sphinx-autodoc by @dswah in https://github.com/dswah/pyGAM/pull/410\n\n\n\n[DOC] remove notebook prompts by @dswah in https://github.com/dswah/pyGAM/pull/413\n\n\n\n[DOC] Fix typo (LogitLink --&gt; LogLink) by @craymichael in https://github.com/dswah/pyGAM/pull/287\n\n\n\n[DOC] TensorTerm construction, Readme, Docs by @dswah in https://github.com/dswah/pyGAM/pull/415\n\n\n\n\n\nNew Contributors\n\n\n\n@nicoleta-kyo made their first contribution in https://github.com/dswah/pyGAM/pull/286\n\n@deniseschmitz42 made their first contribution in https://github.com/dswah/pyGAM/pull/359\n\n@utopianf made their first contribution in https://github.com/dswah/pyGAM/pull/324\n\n@craymichael made their first contribution in https://github.com/dswah/pyGAM/pull/288\n\n@jonathan-taylor made their first contribution in https://github.com/dswah/pyGAM/pull/373\n\n\nAll Contributors\n\n\n\n@nicoleta-kyo\n\n@deniseschmitz42\n\n@utopianf\n\n@craymichael\n\n@jonathan-taylor\n\n@fkiraly\n\n\nFull Changelog: https://github.com/dswah/pyGAM/compare/v0.11.0...v0.12.0","DOI":"10.5281/ZENODO.1208723","license":"Apache License 2.0","publisher":"Zenodo","source":"DOI.org (Datacite)","title":"dswah/pyGAM: v0.12.0","title-short":"dswah/pyGAM","URL":"https://zenodo.org/doi/10.5281/zenodo.1208723","version":"v0.12.0","author":[{"family":"daniel servén","given":""},{"family":"Charlie Brummitt","given":""},{"family":"Franz Király","given":""},{"family":"JodesL","given":""},{"family":"Denise Schmitz","given":""},{"family":"Zachariah Carmichael","given":""},{"family":"Alejandro Ouslan","given":""},{"family":"Fräntz Miccoli","given":""},{"family":"IlyesD","given":""},{"family":"Jonathan Taylor","given":""},{"family":"Joseph Egan","given":""},{"family":"Luc Lapenta","given":""},{"family":"Lucas Servén Marín","given":""},{"family":"Shishin Mo","given":""},{"family":"Shushank Ranjan","given":""},{"family":"Stephen Anthony Rose","given":""},{"family":"Thomas Kraxner","given":""},{"family":"Umberto Fasci","given":""},{"family":"Viktor Szépe","given":""},{"family":"Yasser El Haddar","given":""},{"family":"hlink","given":""},{"family":"Hassan Abedi","given":""},{"family":"nicoleta-kyo","given":""}],"accessed":{"date-parts":[["2026",7,14]]},"issued":{"date-parts":[["2025",12,18]]}}}],"schema":"https://github.com/citation-style-language/schema/raw/master/csl-citation.json"} </w:instrText>
+      </w:r>
+      <w:r>
+        <w:rPr>
+          <w:lang w:val="en-GB"/>
+        </w:rPr>
+        <w:fldChar w:fldCharType="separate"/>
+      </w:r>
+      <w:r>
+        <w:rPr>
+          <w:rFonts w:ascii="Aptos" w:hAnsi="Aptos"/>
+          <w:lang w:val="en-GB"/>
+        </w:rPr>
+        <w:t>(8)</w:t>
+      </w:r>
+      <w:r>
+        <w:rPr>
+          <w:lang w:val="en-GB"/>
+        </w:rPr>
+        <w:fldChar w:fldCharType="end"/>
+      </w:r>
+      <w:r>
+        <w:rPr>
+          <w:lang w:val="en-GB"/>
+        </w:rPr>
+        <w:t>.</w:t>
+      </w:r>
+      <w:r>
+        <w:rPr>
+          <w:lang w:val="en-GB"/>
+        </w:rPr>
+        <w:t xml:space="preserve"> For plots depicting yearly averages, a </w:t>
+      </w:r>
+      <w:r>
+        <w:rPr>
+          <w:lang w:val="en-GB"/>
+        </w:rPr>
+        <w:t>single</w:t>
+      </w:r>
+      <w:r>
+        <w:rPr>
+          <w:lang w:val="en-GB"/>
+        </w:rPr>
+        <w:t xml:space="preserve"> penalised B-spline term was fitted to the time variable </w:t>
+      </w:r>
+      <w:r>
+        <w:rPr>
+          <w:lang w:val="en-GB"/>
+        </w:rPr>
+        <w:t>(s(0), py</w:t>
+      </w:r>
+      <w:r>
+        <w:rPr>
+          <w:lang w:val="en-GB"/>
+        </w:rPr>
+        <w:t>GAM</w:t>
+      </w:r>
+      <w:r>
+        <w:rPr>
+          <w:lang w:val="en-GB"/>
+        </w:rPr>
+        <w:t xml:space="preserve"> default basis dimension).</w:t>
+      </w:r>
+      <w:r>
+        <w:rPr>
+          <w:lang w:val="en-GB"/>
+        </w:rPr>
+        <w:t xml:space="preserve"> For plots depicting monthly averages to acknowledge seasonal connectivity between months, an additive model with two penalised B-spline terms </w:t>
+      </w:r>
+      <w:r>
+        <w:rPr>
+          <w:lang w:val="en-GB"/>
+        </w:rPr>
+        <w:t>on sine- and cosine-transformed month-of-year was used (s(0) + s(1), py</w:t>
+      </w:r>
+      <w:r>
+        <w:rPr>
+          <w:lang w:val="en-GB"/>
+        </w:rPr>
+        <w:t>GAM</w:t>
+      </w:r>
+      <w:r>
+        <w:rPr>
+          <w:lang w:val="en-GB"/>
+        </w:rPr>
+        <w:t xml:space="preserve"> default basis dimension)</w:t>
+      </w:r>
+      <w:r>
+        <w:rPr>
+          <w:lang w:val="en-GB"/>
+        </w:rPr>
+        <w:t xml:space="preserve">. </w:t>
+      </w:r>
+      <w:r>
+        <w:rPr>
+          <w:lang w:val="en-GB"/>
+        </w:rPr>
+        <w:t xml:space="preserve">Predictions were generated over a grid of 200 points spanning either the twelve months of the year or the observed year range, together with 95% confidence intervals reflecting uncertainty in the estimated trend. </w:t>
+      </w:r>
+      <w:r>
+        <w:rPr>
+          <w:lang w:val="en-GB"/>
+        </w:rPr>
+        <w:t>For disease plots with</w:t>
+      </w:r>
+      <w:r>
+        <w:rPr>
+          <w:lang w:val="en-GB"/>
+        </w:rPr>
+        <w:t xml:space="preserve"> corresponding ECDC transmission data (Dengue, Chikungunya, West Nile, Zika), the </w:t>
+      </w:r>
+      <w:r>
+        <w:rPr>
+          <w:lang w:val="en-GB"/>
+        </w:rPr>
+        <w:t xml:space="preserve">points in time with the </w:t>
+      </w:r>
+      <w:r>
+        <w:rPr>
+          <w:lang w:val="en-GB"/>
+        </w:rPr>
+        <w:t xml:space="preserve">first non-zero reported case count, and the </w:t>
+      </w:r>
+      <w:r>
+        <w:rPr>
+          <w:lang w:val="en-GB"/>
+        </w:rPr>
+        <w:t>maximum</w:t>
+      </w:r>
+      <w:r>
+        <w:rPr>
+          <w:lang w:val="en-GB"/>
+        </w:rPr>
+        <w:t xml:space="preserve"> reported cases </w:t>
+      </w:r>
+      <w:r>
+        <w:rPr>
+          <w:lang w:val="en-GB"/>
+        </w:rPr>
+        <w:t xml:space="preserve">were </w:t>
+      </w:r>
+      <w:r>
+        <w:rPr>
+          <w:lang w:val="en-GB"/>
+        </w:rPr>
+        <w:t>indicated on the x-axes</w:t>
+      </w:r>
+      <w:r>
+        <w:rPr>
+          <w:lang w:val="en-GB"/>
+        </w:rPr>
+        <w:t>.</w:t>
+      </w:r>
+    </w:p>
+    <w:p>
+      <w:pPr>
+        <w:rPr>
+          <w:lang w:val="en-GB"/>
+        </w:rPr>
+      </w:pPr>
+    </w:p>
+    <w:p>
+      <w:pPr>
+        <w:rPr>
+          <w:b/>
+          <w:bCs/>
+          <w:sz w:val="28"/>
+          <w:szCs w:val="28"/>
+          <w:lang w:val="en-GB"/>
+        </w:rPr>
+      </w:pPr>
+      <w:r>
+        <w:rPr>
+          <w:b/>
+          <w:bCs/>
+          <w:sz w:val="28"/>
+          <w:szCs w:val="28"/>
+          <w:lang w:val="en-GB"/>
+        </w:rPr>
         <w:t>Topic modelling</w:t>
       </w:r>
     </w:p>
@@ -579,7 +1162,43 @@
         <w:rPr>
           <w:lang w:val="en-GB"/>
         </w:rPr>
-        <w:t xml:space="preserve">The news articles identified during the Mediacloud Solr queries were used for topic modelling to identify common themes across categories. To stay within the Mediacloud API limit, the </w:t>
+        <w:t>The news articles identified during the Media</w:t>
+      </w:r>
+      <w:r>
+        <w:rPr>
+          <w:lang w:val="en-GB"/>
+        </w:rPr>
+        <w:t xml:space="preserve"> C</w:t>
+      </w:r>
+      <w:r>
+        <w:rPr>
+          <w:lang w:val="en-GB"/>
+        </w:rPr>
+        <w:t xml:space="preserve">loud Solr queries were used for topic modelling to identify common themes </w:t>
+      </w:r>
+      <w:r>
+        <w:rPr>
+          <w:lang w:val="en-GB"/>
+        </w:rPr>
+        <w:t xml:space="preserve">of public interest </w:t>
+      </w:r>
+      <w:r>
+        <w:rPr>
+          <w:lang w:val="en-GB"/>
+        </w:rPr>
+        <w:t>across categories. To stay within the Media</w:t>
+      </w:r>
+      <w:r>
+        <w:rPr>
+          <w:lang w:val="en-GB"/>
+        </w:rPr>
+        <w:t xml:space="preserve"> C</w:t>
+      </w:r>
+      <w:r>
+        <w:rPr>
+          <w:lang w:val="en-GB"/>
+        </w:rPr>
+        <w:t xml:space="preserve">loud API limit, the </w:t>
       </w:r>
       <w:r>
         <w:rPr>
@@ -591,14 +1210,26 @@
         <w:rPr>
           <w:lang w:val="en-GB"/>
         </w:rPr>
-        <w:t xml:space="preserve">ediacloud python API v5.1.0 sampling feature was used to sample up to 900 relevant stories for each country/category pairing from the total query pool. If less than 900 stories were available in the total query pool of a country/category pair, all available stories were retrieved. A deduplication step was added to ensure no duplicate news stories were considered. Out of a total of 30597 stories fetched across all countries/categories, only the full text of 21044 (68.8%) could successfully be retrieved due to copyright restrictions on the remaining 9553 (31.2%). However, the percentage of </w:t>
+        <w:t>edia</w:t>
+      </w:r>
+      <w:r>
+        <w:rPr>
+          <w:lang w:val="en-GB"/>
+        </w:rPr>
+        <w:t xml:space="preserve"> C</w:t>
+      </w:r>
+      <w:r>
+        <w:rPr>
+          <w:lang w:val="en-GB"/>
+        </w:rPr>
+        <w:t xml:space="preserve">loud sampling feature was used to sample up to 900 relevant stories for each country/category pairing from the total query pool. If </w:t>
       </w:r>
       <w:r>
         <w:rPr>
           <w:lang w:val="en-GB"/>
         </w:rPr>
         <w:lastRenderedPageBreak/>
-        <w:t>retrieved texts across categories and countries was fairly consistent, meaning no group was significantly underrepresented. Full texts were cleaned by removing boilerplate phrases, links, email addresses, social media handles, phot</w:t>
+        <w:t>less than 900 stories were available in the total query pool of a country/category pair, all available stories were retrieved. A deduplication step was added to ensure no duplicate news stories were considered. Out of a total of 30597 stories fetched across all countries/categories, only the full text of 21044 (68.8%) could successfully be retrieved due to copyright restrictions on the remaining 9553 (31.2%). However, the percentage of retrieved texts across categories and countries was fairly consistent, meaning no group was significantly underrepresented. Full texts were cleaned by removing boilerplate phrases, links, email addresses, social media handles, phot</w:t>
       </w:r>
       <w:r>
         <w:rPr>
@@ -647,7 +1278,93 @@
         <w:rPr>
           <w:lang w:val="en-GB"/>
         </w:rPr>
-        <w:t xml:space="preserve">opic library v0.17.4 was used. The embedding model was created using the Sentence Transformers v3.0.1 model </w:t>
+        <w:t>opic library v0.17.4</w:t>
+      </w:r>
+      <w:r>
+        <w:rPr>
+          <w:lang w:val="en-GB"/>
+        </w:rPr>
+        <w:t xml:space="preserve"> </w:t>
+      </w:r>
+      <w:r>
+        <w:rPr>
+          <w:lang w:val="en-GB"/>
+        </w:rPr>
+        <w:fldChar w:fldCharType="begin"/>
+      </w:r>
+      <w:r>
+        <w:rPr>
+          <w:lang w:val="en-GB"/>
+        </w:rPr>
+        <w:instrText xml:space="preserve"> ADDIN ZOTERO_ITEM CSL_CITATION {"citationID":"cTFpgi25","properties":{"unsorted":false,"formattedCitation":"(9)","plainCitation":"(9)","noteIndex":0},"citationItems":[{"id":36,"uris":["http://zotero.org/groups/6613661/items/2BVCJV2R"],"itemData":{"id":36,"type":"article","abstract":"Topic models can be useful tools to discover latent topics in collections of documents. Recent studies have shown the feasibility of approach topic modeling as a clustering task. We present BERTopic, a topic model that extends this process by extracting coherent topic representation through the development of a class-based variation of TF-IDF. More specifically, BERTopic generates document embedding with pre-trained transformer-based language models, clusters these embeddings, and finally, generates topic representations with the class-based TF-IDF procedure. BERTopic generates coherent topics and remains competitive across a variety of benchmarks involving classical models and those that follow the more recent clustering approach of topic modeling.","DOI":"10.48550/ARXIV.2203.05794","license":"arXiv.org perpetual, non-exclusive license","note":"version: 1","publisher":"arXiv","source":"DOI.org (Datacite)","title":"BERTopic: Neural topic modeling with a class-based TF-IDF procedure","title-short":"BERTopic","URL":"https://arxiv.org/abs/2203.05794","author":[{"family":"Grootendorst","given":"Maarten"}],"accessed":{"date-parts":[["2026",7,14]]},"issued":{"date-parts":[["2022"]]}}}],"schema":"https://github.com/citation-style-language/schema/raw/master/csl-citation.json"} </w:instrText>
+      </w:r>
+      <w:r>
+        <w:rPr>
+          <w:lang w:val="en-GB"/>
+        </w:rPr>
+        <w:fldChar w:fldCharType="separate"/>
+      </w:r>
+      <w:r>
+        <w:rPr>
+          <w:rFonts w:ascii="Aptos" w:hAnsi="Aptos"/>
+          <w:lang w:val="en-GB"/>
+        </w:rPr>
+        <w:t>(9)</w:t>
+      </w:r>
+      <w:r>
+        <w:rPr>
+          <w:lang w:val="en-GB"/>
+        </w:rPr>
+        <w:fldChar w:fldCharType="end"/>
+      </w:r>
+      <w:r>
+        <w:rPr>
+          <w:lang w:val="en-GB"/>
+        </w:rPr>
+        <w:t xml:space="preserve"> was used. The embedding model was created using the Sentence Transformers v3.0.1</w:t>
+      </w:r>
+      <w:r>
+        <w:rPr>
+          <w:lang w:val="en-GB"/>
+        </w:rPr>
+        <w:t xml:space="preserve"> </w:t>
+      </w:r>
+      <w:r>
+        <w:rPr>
+          <w:lang w:val="en-GB"/>
+        </w:rPr>
+        <w:fldChar w:fldCharType="begin"/>
+      </w:r>
+      <w:r>
+        <w:rPr>
+          <w:lang w:val="en-GB"/>
+        </w:rPr>
+        <w:instrText xml:space="preserve"> ADDIN ZOTERO_ITEM CSL_CITATION {"citationID":"qr9eUPha","properties":{"unsorted":false,"formattedCitation":"(10)","plainCitation":"(10)","noteIndex":0},"citationItems":[{"id":38,"uris":["http://zotero.org/groups/6613661/items/NPWWN6QN"],"itemData":{"id":38,"type":"article","abstract":"BERT (Devlin et al., 2018) and RoBERTa (Liu et al., 2019) has set a new state-of-the-art performance on sentence-pair regression tasks like semantic textual similarity (STS). However, it requires that both sentences are fed into the network, which causes a massive computational overhead: Finding the most similar pair in a collection of 10,000 sentences requires about 50 million inference computations (~65 hours) with BERT. The construction of BERT makes it unsuitable for semantic similarity search as well as for unsupervised tasks like clustering. In this publication, we present Sentence-BERT (SBERT), a modification of the pretrained BERT network that use siamese and triplet network structures to derive semantically meaningful sentence embeddings that can be compared using cosine-similarity. This reduces the effort for finding the most similar pair from 65 hours with BERT / RoBERTa to about 5 seconds with SBERT, while maintaining the accuracy from BERT. We evaluate SBERT and SRoBERTa on common STS tasks and transfer learning tasks, where it outperforms other state-of-the-art sentence embeddings methods.","DOI":"10.48550/ARXIV.1908.10084","license":"Creative Commons Attribution Share Alike 4.0 International","note":"version: 1","publisher":"arXiv","publisher-place":"Software: Sentence Transformers v3.0.1, https://github.com/UKPLab/sentence-transformers","source":"DOI.org (Datacite)","title":"Sentence-BERT: Sentence Embeddings using Siamese BERT-Networks","title-short":"Sentence-BERT","URL":"https://arxiv.org/abs/1908.10084","author":[{"family":"Reimers","given":"Nils"},{"family":"Gurevych","given":"Iryna"}],"accessed":{"date-parts":[["2026",7,14]]},"issued":{"date-parts":[["2019"]]}}}],"schema":"https://github.com/citation-style-language/schema/raw/master/csl-citation.json"} </w:instrText>
+      </w:r>
+      <w:r>
+        <w:rPr>
+          <w:lang w:val="en-GB"/>
+        </w:rPr>
+        <w:fldChar w:fldCharType="separate"/>
+      </w:r>
+      <w:r>
+        <w:rPr>
+          <w:rFonts w:ascii="Aptos" w:hAnsi="Aptos"/>
+          <w:lang w:val="en-GB"/>
+        </w:rPr>
+        <w:t>(10)</w:t>
+      </w:r>
+      <w:r>
+        <w:rPr>
+          <w:lang w:val="en-GB"/>
+        </w:rPr>
+        <w:fldChar w:fldCharType="end"/>
+      </w:r>
+      <w:r>
+        <w:rPr>
+          <w:lang w:val="en-GB"/>
+        </w:rPr>
+        <w:t xml:space="preserve"> model </w:t>
       </w:r>
       <w:r>
         <w:rPr>
@@ -659,7 +1376,242 @@
         <w:rPr>
           <w:lang w:val="en-GB"/>
         </w:rPr>
-        <w:t xml:space="preserve">. The vectorizer model was customised by including all spaCy v3.8.14 stopword lists for the relevant languages. The representation model was built using KeyBERT and MMR. A grid search was conducted to determine optimal parameters for n_components, min_cluster, and n_neighbours for each topic model. A separate topic model was run for each category. Optimal parameters were deemed as such where 5-20 topics were generated with an outlier rate &lt;25% and the biggest topic including &lt;60% of documents. Where no optimal parameters were determined, the next best solution was used </w:t>
+        <w:t xml:space="preserve">. The vectorizer model was customised by including all spaCy v3.8.14 </w:t>
+      </w:r>
+      <w:r>
+        <w:rPr>
+          <w:lang w:val="en-GB"/>
+        </w:rPr>
+        <w:fldChar w:fldCharType="begin"/>
+      </w:r>
+      <w:r>
+        <w:rPr>
+          <w:lang w:val="en-GB"/>
+        </w:rPr>
+        <w:instrText xml:space="preserve"> ADDIN ZOTERO_ITEM CSL_CITATION {"citationID":"HTdtZVie","properties":{"unsorted":false,"formattedCitation":"(11)","plainCitation":"(11)","noteIndex":0},"citationItems":[{"id":40,"uris":["http://zotero.org/groups/6613661/items/MJNTPF7D"],"itemData":{"id":40,"type":"software","abstract":"</w:instrText>
+      </w:r>
+      <w:r>
+        <w:rPr>
+          <w:rFonts w:ascii="Segoe UI Emoji" w:hAnsi="Segoe UI Emoji" w:cs="Segoe UI Emoji"/>
+          <w:lang w:val="en-GB"/>
+        </w:rPr>
+        <w:instrText>✨</w:instrText>
+      </w:r>
+      <w:r>
+        <w:rPr>
+          <w:lang w:val="en-GB"/>
+        </w:rPr>
+        <w:instrText xml:space="preserve"> New features and improvements\n\n\n\nUpdate __all__ fields (#13063).\n\n\n</w:instrText>
+      </w:r>
+      <w:r>
+        <w:rPr>
+          <w:rFonts w:ascii="Segoe UI Emoji" w:hAnsi="Segoe UI Emoji" w:cs="Segoe UI Emoji"/>
+          <w:lang w:val="en-GB"/>
+        </w:rPr>
+        <w:instrText>🔴</w:instrText>
+      </w:r>
+      <w:r>
+        <w:rPr>
+          <w:lang w:val="en-GB"/>
+        </w:rPr>
+        <w:instrText xml:space="preserve"> Bug fixes\n\n\n\n#13035: Remove Pathy requirement.\n\n#13053: Restore spacy.cli.project API.\n\n#13057: Support Any comparisons for Token and Span.\n\n\n</w:instrText>
+      </w:r>
+      <w:r>
+        <w:rPr>
+          <w:rFonts w:ascii="Segoe UI Emoji" w:hAnsi="Segoe UI Emoji" w:cs="Segoe UI Emoji"/>
+          <w:lang w:val="en-GB"/>
+        </w:rPr>
+        <w:instrText>📖</w:instrText>
+      </w:r>
+      <w:r>
+        <w:rPr>
+          <w:lang w:val="en-GB"/>
+        </w:rPr>
+        <w:instrText xml:space="preserve"> Documentation and examples\n\n\n\nMany updates for spacy-llm including Azure OpenAI, PaLM, and Mistral support.\n\nVarious documentation corrections.\n\n\n</w:instrText>
+      </w:r>
+      <w:r>
+        <w:rPr>
+          <w:rFonts w:ascii="Segoe UI Emoji" w:hAnsi="Segoe UI Emoji" w:cs="Segoe UI Emoji"/>
+          <w:lang w:val="en-GB"/>
+        </w:rPr>
+        <w:instrText>👥</w:instrText>
+      </w:r>
+      <w:r>
+        <w:rPr>
+          <w:lang w:val="en-GB"/>
+        </w:rPr>
+        <w:instrText xml:space="preserve"> Contributors\n\n@adrianeboyd, @honnibal, @ines, @rmitsch, @svlandeg","DOI":"10.5281/ZENODO.1212303","license":"Creative Commons Attribution 4.0 International","publisher":"Zenodo","source":"DOI.org (Datacite)","title":"explosion/spaCy: v3.7.2: Fixes for APIs and requirements","title-short":"explosion/spaCy","URL":"https://zenodo.org/doi/10.5281/zenodo.1212303","version":"v3.7.2","author":[{"family":"Ines Montani","given":""},{"family":"Matthew Honnibal","given":""},{"family":"Adriane Boyd","given":""},{"family":"Sofie Van Landeghem","given":""},{"family":"Henning Peters","given":""}],"accessed":{"date-parts":[["2026",7,14]]},"issued":{"date-parts":[["2023",10,16]]}}}],"schema":"https://github.com/citation-style-language/schema/raw/master/csl-citation.json"} </w:instrText>
+      </w:r>
+      <w:r>
+        <w:rPr>
+          <w:lang w:val="en-GB"/>
+        </w:rPr>
+        <w:fldChar w:fldCharType="separate"/>
+      </w:r>
+      <w:r>
+        <w:rPr>
+          <w:rFonts w:ascii="Aptos" w:hAnsi="Aptos"/>
+          <w:lang w:val="en-GB"/>
+        </w:rPr>
+        <w:t>(11)</w:t>
+      </w:r>
+      <w:r>
+        <w:rPr>
+          <w:lang w:val="en-GB"/>
+        </w:rPr>
+        <w:fldChar w:fldCharType="end"/>
+      </w:r>
+      <w:r>
+        <w:rPr>
+          <w:lang w:val="en-GB"/>
+        </w:rPr>
+        <w:t xml:space="preserve"> </w:t>
+      </w:r>
+      <w:r>
+        <w:rPr>
+          <w:lang w:val="en-GB"/>
+        </w:rPr>
+        <w:t xml:space="preserve">stopword lists for the relevant languages. </w:t>
+      </w:r>
+      <w:r>
+        <w:rPr>
+          <w:lang w:val="en-GB"/>
+        </w:rPr>
+        <w:t>Topic representations</w:t>
+      </w:r>
+      <w:r>
+        <w:rPr>
+          <w:lang w:val="en-GB"/>
+        </w:rPr>
+        <w:t xml:space="preserve"> </w:t>
+      </w:r>
+      <w:r>
+        <w:rPr>
+          <w:lang w:val="en-GB"/>
+        </w:rPr>
+        <w:t>were generated</w:t>
+      </w:r>
+      <w:r>
+        <w:rPr>
+          <w:lang w:val="en-GB"/>
+        </w:rPr>
+        <w:t xml:space="preserve"> using </w:t>
+      </w:r>
+      <w:r>
+        <w:rPr>
+          <w:lang w:val="en-GB"/>
+        </w:rPr>
+        <w:t xml:space="preserve">a </w:t>
+      </w:r>
+      <w:r>
+        <w:rPr>
+          <w:lang w:val="en-GB"/>
+        </w:rPr>
+        <w:t>KeyBERT</w:t>
+      </w:r>
+      <w:r>
+        <w:rPr>
+          <w:lang w:val="en-GB"/>
+        </w:rPr>
+        <w:t xml:space="preserve">-inspired representation model </w:t>
+      </w:r>
+      <w:r>
+        <w:rPr>
+          <w:lang w:val="en-GB"/>
+        </w:rPr>
+        <w:fldChar w:fldCharType="begin"/>
+      </w:r>
+      <w:r>
+        <w:rPr>
+          <w:lang w:val="en-GB"/>
+        </w:rPr>
+        <w:instrText xml:space="preserve"> ADDIN ZOTERO_ITEM CSL_CITATION {"citationID":"t4hHJ71f","properties":{"unsorted":false,"formattedCitation":"(12)","plainCitation":"(12)","noteIndex":0},"citationItems":[{"id":41,"uris":["http://zotero.org/groups/6613661/items/KUNR22D8"],"itemData":{"id":41,"type":"software","abstract":"This release is meant as a way to create a DOI through Zenodo.","DOI":"10.5281/ZENODO.4461265","license":"Open Access","publisher":"Zenodo","source":"DOI.org (Datacite)","title":"MaartenGr/KeyBERT: BibTeX","title-short":"MaartenGr/KeyBERT","URL":"https://zenodo.org/record/4461265","version":"v0.1.3","author":[{"family":"Grootendorst","given":"Maarten"}],"accessed":{"date-parts":[["2026",7,14]]},"issued":{"date-parts":[["2021",1,25]]}}}],"schema":"https://github.com/citation-style-language/schema/raw/master/csl-citation.json"} </w:instrText>
+      </w:r>
+      <w:r>
+        <w:rPr>
+          <w:lang w:val="en-GB"/>
+        </w:rPr>
+        <w:fldChar w:fldCharType="separate"/>
+      </w:r>
+      <w:r>
+        <w:rPr>
+          <w:rFonts w:ascii="Aptos" w:hAnsi="Aptos"/>
+          <w:lang w:val="en-GB"/>
+        </w:rPr>
+        <w:t>(12)</w:t>
+      </w:r>
+      <w:r>
+        <w:rPr>
+          <w:lang w:val="en-GB"/>
+        </w:rPr>
+        <w:fldChar w:fldCharType="end"/>
+      </w:r>
+      <w:r>
+        <w:rPr>
+          <w:lang w:val="en-GB"/>
+        </w:rPr>
+        <w:t xml:space="preserve"> and </w:t>
+      </w:r>
+      <w:r>
+        <w:rPr>
+          <w:lang w:val="en-GB"/>
+        </w:rPr>
+        <w:t xml:space="preserve">Maximal Marginal Relevance </w:t>
+      </w:r>
+      <w:r>
+        <w:rPr>
+          <w:lang w:val="en-GB"/>
+        </w:rPr>
+        <w:t>(</w:t>
+      </w:r>
+      <w:r>
+        <w:rPr>
+          <w:lang w:val="en-GB"/>
+        </w:rPr>
+        <w:t>MMR</w:t>
+      </w:r>
+      <w:r>
+        <w:rPr>
+          <w:lang w:val="en-GB"/>
+        </w:rPr>
+        <w:t xml:space="preserve">) </w:t>
+      </w:r>
+      <w:r>
+        <w:rPr>
+          <w:lang w:val="en-GB"/>
+        </w:rPr>
+        <w:fldChar w:fldCharType="begin"/>
+      </w:r>
+      <w:r>
+        <w:rPr>
+          <w:lang w:val="en-GB"/>
+        </w:rPr>
+        <w:instrText xml:space="preserve"> ADDIN ZOTERO_ITEM CSL_CITATION {"citationID":"DnHQ8PR5","properties":{"unsorted":false,"formattedCitation":"(13)","plainCitation":"(13)","noteIndex":0},"citationItems":[{"id":42,"uris":["http://zotero.org/groups/6613661/items/2QGFPXQ3"],"itemData":{"id":42,"type":"paper-conference","container-title":"Proceedings of the 21st annual international ACM SIGIR conference on Research and development in information retrieval","DOI":"10.1145/290941.291025","event-title":"SIGIR98: 21st Annual ACM/SIGIR International Conference on Research and Development in Information Retrieval","ISBN":"978-1-58113-015-7","language":"en","page":"335-336","publisher":"ACM","publisher-place":"Melbourne Australia","source":"DOI.org (Crossref)","title":"The use of MMR, diversity-based reranking for reordering documents and producing summaries","URL":"https://dl.acm.org/doi/10.1145/290941.291025","author":[{"family":"Carbonell","given":"Jaime"},{"family":"Goldstein","given":"Jade"}],"accessed":{"date-parts":[["2026",7,14]]},"issued":{"date-parts":[["1998",8]]}}}],"schema":"https://github.com/citation-style-language/schema/raw/master/csl-citation.json"} </w:instrText>
+      </w:r>
+      <w:r>
+        <w:rPr>
+          <w:lang w:val="en-GB"/>
+        </w:rPr>
+        <w:fldChar w:fldCharType="separate"/>
+      </w:r>
+      <w:r>
+        <w:rPr>
+          <w:rFonts w:ascii="Aptos" w:hAnsi="Aptos"/>
+          <w:lang w:val="en-GB"/>
+        </w:rPr>
+        <w:t>(13)</w:t>
+      </w:r>
+      <w:r>
+        <w:rPr>
+          <w:lang w:val="en-GB"/>
+        </w:rPr>
+        <w:fldChar w:fldCharType="end"/>
+      </w:r>
+      <w:r>
+        <w:rPr>
+          <w:lang w:val="en-GB"/>
+        </w:rPr>
+        <w:t xml:space="preserve">. A grid search was conducted to determine optimal parameters for n_components, min_cluster, and n_neighbours for each topic model. A separate topic model was run for each category. Optimal parameters were deemed as such where 5-20 topics were generated with an outlier rate &lt;25% and the biggest topic including &lt;60% of documents. Where no optimal parameters were determined, the next best solution was used </w:t>
       </w:r>
       <w:commentRangeStart w:id="1"/>
       <w:r>
@@ -1046,15 +1998,7 @@
                 <w:szCs w:val="18"/>
                 <w:lang w:val="en-GB"/>
               </w:rPr>
-              <w:t>1</w:t>
-            </w:r>
-            <w:r>
-              <w:rPr>
-                <w:sz w:val="18"/>
-                <w:szCs w:val="18"/>
-                <w:lang w:val="en-GB"/>
-              </w:rPr>
-              <w:t>8</w:t>
+              <w:t>18</w:t>
             </w:r>
           </w:p>
         </w:tc>
@@ -1077,15 +2021,7 @@
                 <w:szCs w:val="18"/>
                 <w:lang w:val="en-GB"/>
               </w:rPr>
-              <w:t>23.</w:t>
-            </w:r>
-            <w:r>
-              <w:rPr>
-                <w:sz w:val="18"/>
-                <w:szCs w:val="18"/>
-                <w:lang w:val="en-GB"/>
-              </w:rPr>
-              <w:t>85</w:t>
+              <w:t>23.85</w:t>
             </w:r>
           </w:p>
         </w:tc>
@@ -1391,15 +2327,7 @@
                 <w:szCs w:val="18"/>
                 <w:lang w:val="en-GB"/>
               </w:rPr>
-              <w:t>2</w:t>
-            </w:r>
-            <w:r>
-              <w:rPr>
-                <w:sz w:val="18"/>
-                <w:szCs w:val="18"/>
-                <w:lang w:val="en-GB"/>
-              </w:rPr>
-              <w:t>1</w:t>
+              <w:t>21</w:t>
             </w:r>
           </w:p>
         </w:tc>
@@ -2299,6 +3227,7 @@
         <w:rPr>
           <w:lang w:val="en-GB"/>
         </w:rPr>
+        <w:lastRenderedPageBreak/>
         <w:t xml:space="preserve">For each topic, the topic representations and 10 representative abstracts were manually inspected and </w:t>
       </w:r>
       <w:commentRangeStart w:id="2"/>
@@ -2334,14 +3263,19 @@
         <w:rPr>
           <w:lang w:val="en-GB"/>
         </w:rPr>
-        <w:t xml:space="preserve">, Aedes retained 19 topics, Chikungunya 14, Culex 8, Dengue 12, Usutu 10, West Nile 10, Zika 9, and the anchor category 7 topics. Next, outliers for each topic model were reassigned based on the </w:t>
-      </w:r>
-      <w:r>
-        <w:rPr>
-          <w:lang w:val="en-GB"/>
-        </w:rPr>
-        <w:lastRenderedPageBreak/>
-        <w:t>following conditions: if the probability distribution of a keyword &gt;0.2 for at least 2 topics, this outlier was relabelled an interdisciplinary text. If a text had a probability distribution of &gt;0.3 for at least 1 topic, the text was assigned to that topic. Any other outlier was labelled a “true outlier”; for Aedes the outlier rate was 8.96%, for Chikungunya 11.17%, for Dengue 8.21%, for West Nile 3.93%, for Zika 3.48%, for Culex 2.48%, for Usutu 4.44%, and for the anchor 11.6%.</w:t>
+        <w:t xml:space="preserve">, Aedes retained 19 topics, Chikungunya 14, Culex 8, Dengue 12, Usutu 10, West Nile 10, Zika 9, and the anchor category 7 topics. Next, outliers for each topic model were reassigned based on the following conditions: if the probability distribution of a keyword &gt;0.2 for at least 2 topics, this outlier was relabelled an interdisciplinary text. If a text had a probability distribution of &gt;0.3 for at least 1 topic, the text was assigned to that topic. Any other outlier was labelled a “true outlier”; for Aedes the </w:t>
+      </w:r>
+      <w:r>
+        <w:rPr>
+          <w:lang w:val="en-GB"/>
+        </w:rPr>
+        <w:t xml:space="preserve">true </w:t>
+      </w:r>
+      <w:r>
+        <w:rPr>
+          <w:lang w:val="en-GB"/>
+        </w:rPr>
+        <w:t>outlier rate was 8.96%, for Chikungunya 11.17%, for Dengue 8.21%, for West Nile 3.93%, for Zika 3.48%, for Culex 2.48%, for Usutu 4.44%, and for the anchor 11.6%.</w:t>
       </w:r>
     </w:p>
     <w:p>
@@ -2376,656 +3310,321 @@
     </w:p>
     <w:p>
       <w:pPr>
-        <w:spacing w:before="100" w:beforeAutospacing="1" w:after="100" w:afterAutospacing="1" w:line="240" w:lineRule="auto"/>
-        <w:outlineLvl w:val="2"/>
-        <w:rPr>
-          <w:rFonts w:ascii="Times New Roman" w:eastAsia="Times New Roman" w:hAnsi="Times New Roman" w:cs="Times New Roman"/>
-          <w:b/>
-          <w:bCs/>
-          <w:kern w:val="0"/>
-          <w:sz w:val="27"/>
-          <w:szCs w:val="27"/>
-          <w:lang w:val="en-GB" w:eastAsia="en-GB"/>
-          <w14:ligatures w14:val="none"/>
-        </w:rPr>
-      </w:pPr>
-      <w:commentRangeStart w:id="4"/>
-      <w:r>
-        <w:rPr>
-          <w:rFonts w:ascii="Times New Roman" w:eastAsia="Times New Roman" w:hAnsi="Times New Roman" w:cs="Times New Roman"/>
-          <w:b/>
-          <w:bCs/>
-          <w:kern w:val="0"/>
-          <w:sz w:val="27"/>
-          <w:szCs w:val="27"/>
-          <w:lang w:val="en-GB" w:eastAsia="en-GB"/>
-          <w14:ligatures w14:val="none"/>
-        </w:rPr>
-        <w:t>Reference links for packages mentioned</w:t>
-      </w:r>
-      <w:commentRangeEnd w:id="4"/>
-      <w:r>
-        <w:rPr>
-          <w:rStyle w:val="CommentReference"/>
-          <w:rFonts w:ascii="Times New Roman" w:eastAsia="Times New Roman" w:hAnsi="Times New Roman" w:cs="Times New Roman"/>
-          <w:b/>
-          <w:bCs/>
-          <w:kern w:val="0"/>
-          <w:sz w:val="27"/>
-          <w:szCs w:val="27"/>
-          <w:lang w:val="en-GB" w:eastAsia="en-GB"/>
-          <w14:ligatures w14:val="none"/>
-        </w:rPr>
-        <w:commentReference w:id="4"/>
-      </w:r>
-    </w:p>
-    <w:p>
-      <w:pPr>
-        <w:numPr>
-          <w:ilvl w:val="0"/>
-          <w:numId w:val="3"/>
-        </w:numPr>
-        <w:spacing w:before="100" w:beforeAutospacing="1" w:after="100" w:afterAutospacing="1" w:line="240" w:lineRule="auto"/>
-        <w:rPr>
-          <w:rFonts w:ascii="Times New Roman" w:eastAsia="Times New Roman" w:hAnsi="Times New Roman" w:cs="Times New Roman"/>
-          <w:kern w:val="0"/>
-          <w:lang w:val="en-GB" w:eastAsia="en-GB"/>
-          <w14:ligatures w14:val="none"/>
-        </w:rPr>
-      </w:pPr>
-      <w:r>
-        <w:rPr>
-          <w:rFonts w:ascii="Times New Roman" w:eastAsia="Times New Roman" w:hAnsi="Times New Roman" w:cs="Times New Roman"/>
-          <w:b/>
-          <w:bCs/>
-          <w:kern w:val="0"/>
-          <w:lang w:val="en-GB" w:eastAsia="en-GB"/>
-          <w14:ligatures w14:val="none"/>
-        </w:rPr>
-        <w:t>trendspy v0.1.6</w:t>
-      </w:r>
-      <w:r>
-        <w:rPr>
-          <w:rFonts w:ascii="Times New Roman" w:eastAsia="Times New Roman" w:hAnsi="Times New Roman" w:cs="Times New Roman"/>
-          <w:kern w:val="0"/>
-          <w:lang w:val="en-GB" w:eastAsia="en-GB"/>
-          <w14:ligatures w14:val="none"/>
-        </w:rPr>
-        <w:t xml:space="preserve"> — GitHub: </w:t>
-      </w:r>
-      <w:hyperlink r:id="rId9" w:history="1">
-        <w:r>
-          <w:rPr>
-            <w:rFonts w:ascii="Times New Roman" w:eastAsia="Times New Roman" w:hAnsi="Times New Roman" w:cs="Times New Roman"/>
-            <w:color w:val="0000FF"/>
-            <w:kern w:val="0"/>
-            <w:u w:val="single"/>
-            <w:lang w:val="en-GB" w:eastAsia="en-GB"/>
-            <w14:ligatures w14:val="none"/>
-          </w:rPr>
-          <w:t>https://github.com/sdil87/trendspy</w:t>
-        </w:r>
-      </w:hyperlink>
-      <w:r>
-        <w:rPr>
-          <w:rFonts w:ascii="Times New Roman" w:eastAsia="Times New Roman" w:hAnsi="Times New Roman" w:cs="Times New Roman"/>
-          <w:kern w:val="0"/>
-          <w:lang w:val="en-GB" w:eastAsia="en-GB"/>
-          <w14:ligatures w14:val="none"/>
-        </w:rPr>
-        <w:t xml:space="preserve"> · PyPI: </w:t>
-      </w:r>
-      <w:hyperlink r:id="rId10" w:history="1">
-        <w:r>
-          <w:rPr>
-            <w:rFonts w:ascii="Times New Roman" w:eastAsia="Times New Roman" w:hAnsi="Times New Roman" w:cs="Times New Roman"/>
-            <w:color w:val="0000FF"/>
-            <w:kern w:val="0"/>
-            <w:u w:val="single"/>
-            <w:lang w:val="en-GB" w:eastAsia="en-GB"/>
-            <w14:ligatures w14:val="none"/>
-          </w:rPr>
-          <w:t>https://pypi.org/project/trendspy/</w:t>
-        </w:r>
-      </w:hyperlink>
-    </w:p>
-    <w:p>
-      <w:pPr>
-        <w:numPr>
-          <w:ilvl w:val="0"/>
-          <w:numId w:val="3"/>
-        </w:numPr>
-        <w:spacing w:before="100" w:beforeAutospacing="1" w:after="100" w:afterAutospacing="1" w:line="240" w:lineRule="auto"/>
-        <w:rPr>
-          <w:rFonts w:ascii="Times New Roman" w:eastAsia="Times New Roman" w:hAnsi="Times New Roman" w:cs="Times New Roman"/>
-          <w:kern w:val="0"/>
-          <w:lang w:val="en-GB" w:eastAsia="en-GB"/>
-          <w14:ligatures w14:val="none"/>
-        </w:rPr>
-      </w:pPr>
-      <w:r>
-        <w:rPr>
-          <w:rFonts w:ascii="Times New Roman" w:eastAsia="Times New Roman" w:hAnsi="Times New Roman" w:cs="Times New Roman"/>
-          <w:b/>
-          <w:bCs/>
-          <w:kern w:val="0"/>
-          <w:lang w:val="en-GB" w:eastAsia="en-GB"/>
-          <w14:ligatures w14:val="none"/>
-        </w:rPr>
-        <w:t>pygam v0.12.0</w:t>
-      </w:r>
-      <w:r>
-        <w:rPr>
-          <w:rFonts w:ascii="Times New Roman" w:eastAsia="Times New Roman" w:hAnsi="Times New Roman" w:cs="Times New Roman"/>
-          <w:kern w:val="0"/>
-          <w:lang w:val="en-GB" w:eastAsia="en-GB"/>
-          <w14:ligatures w14:val="none"/>
-        </w:rPr>
-        <w:t xml:space="preserve"> — GitHub: </w:t>
-      </w:r>
-      <w:hyperlink r:id="rId11" w:history="1">
-        <w:r>
-          <w:rPr>
-            <w:rFonts w:ascii="Times New Roman" w:eastAsia="Times New Roman" w:hAnsi="Times New Roman" w:cs="Times New Roman"/>
-            <w:color w:val="0000FF"/>
-            <w:kern w:val="0"/>
-            <w:u w:val="single"/>
-            <w:lang w:val="en-GB" w:eastAsia="en-GB"/>
-            <w14:ligatures w14:val="none"/>
-          </w:rPr>
-          <w:t>https://github.com/dswah/pyGAM</w:t>
-        </w:r>
-      </w:hyperlink>
-      <w:r>
-        <w:rPr>
-          <w:rFonts w:ascii="Times New Roman" w:eastAsia="Times New Roman" w:hAnsi="Times New Roman" w:cs="Times New Roman"/>
-          <w:kern w:val="0"/>
-          <w:lang w:val="en-GB" w:eastAsia="en-GB"/>
-          <w14:ligatures w14:val="none"/>
-        </w:rPr>
-        <w:t xml:space="preserve"> · Citation (Zenodo DOI): </w:t>
-      </w:r>
-      <w:hyperlink r:id="rId12" w:history="1">
-        <w:r>
-          <w:rPr>
-            <w:rFonts w:ascii="Times New Roman" w:eastAsia="Times New Roman" w:hAnsi="Times New Roman" w:cs="Times New Roman"/>
-            <w:color w:val="0000FF"/>
-            <w:kern w:val="0"/>
-            <w:u w:val="single"/>
-            <w:lang w:val="en-GB" w:eastAsia="en-GB"/>
-            <w14:ligatures w14:val="none"/>
-          </w:rPr>
-          <w:t>https://doi.org/10.5281/zenodo.1208723</w:t>
-        </w:r>
-      </w:hyperlink>
-      <w:r>
-        <w:rPr>
-          <w:rFonts w:ascii="Times New Roman" w:eastAsia="Times New Roman" w:hAnsi="Times New Roman" w:cs="Times New Roman"/>
-          <w:kern w:val="0"/>
-          <w:lang w:val="en-GB" w:eastAsia="en-GB"/>
-          <w14:ligatures w14:val="none"/>
-        </w:rPr>
-        <w:t xml:space="preserve"> (Servén &amp; Brummitt, 2018)</w:t>
-      </w:r>
-    </w:p>
-    <w:p>
-      <w:pPr>
-        <w:numPr>
-          <w:ilvl w:val="0"/>
-          <w:numId w:val="3"/>
-        </w:numPr>
-        <w:spacing w:before="100" w:beforeAutospacing="1" w:after="100" w:afterAutospacing="1" w:line="240" w:lineRule="auto"/>
-        <w:rPr>
-          <w:rFonts w:ascii="Times New Roman" w:eastAsia="Times New Roman" w:hAnsi="Times New Roman" w:cs="Times New Roman"/>
-          <w:kern w:val="0"/>
-          <w:lang w:val="en-GB" w:eastAsia="en-GB"/>
-          <w14:ligatures w14:val="none"/>
-        </w:rPr>
-      </w:pPr>
-      <w:r>
-        <w:rPr>
-          <w:rFonts w:ascii="Times New Roman" w:eastAsia="Times New Roman" w:hAnsi="Times New Roman" w:cs="Times New Roman"/>
-          <w:b/>
-          <w:bCs/>
-          <w:kern w:val="0"/>
-          <w:lang w:val="en-GB" w:eastAsia="en-GB"/>
-          <w14:ligatures w14:val="none"/>
-        </w:rPr>
-        <w:t>Mediacloud Python API (v5.1.0)</w:t>
-      </w:r>
-      <w:r>
-        <w:rPr>
-          <w:rFonts w:ascii="Times New Roman" w:eastAsia="Times New Roman" w:hAnsi="Times New Roman" w:cs="Times New Roman"/>
-          <w:kern w:val="0"/>
-          <w:lang w:val="en-GB" w:eastAsia="en-GB"/>
-          <w14:ligatures w14:val="none"/>
-        </w:rPr>
-        <w:t xml:space="preserve"> — GitHub: </w:t>
-      </w:r>
-      <w:hyperlink r:id="rId13" w:history="1">
-        <w:r>
-          <w:rPr>
-            <w:rFonts w:ascii="Times New Roman" w:eastAsia="Times New Roman" w:hAnsi="Times New Roman" w:cs="Times New Roman"/>
-            <w:color w:val="0000FF"/>
-            <w:kern w:val="0"/>
-            <w:u w:val="single"/>
-            <w:lang w:val="en-GB" w:eastAsia="en-GB"/>
-            <w14:ligatures w14:val="none"/>
-          </w:rPr>
-          <w:t>https://github.com/mediacloud/api-client</w:t>
-        </w:r>
-      </w:hyperlink>
-      <w:r>
-        <w:rPr>
-          <w:rFonts w:ascii="Times New Roman" w:eastAsia="Times New Roman" w:hAnsi="Times New Roman" w:cs="Times New Roman"/>
-          <w:kern w:val="0"/>
-          <w:lang w:val="en-GB" w:eastAsia="en-GB"/>
-          <w14:ligatures w14:val="none"/>
-        </w:rPr>
-        <w:t xml:space="preserve"> · PyPI: </w:t>
-      </w:r>
-      <w:hyperlink r:id="rId14" w:history="1">
-        <w:r>
-          <w:rPr>
-            <w:rFonts w:ascii="Times New Roman" w:eastAsia="Times New Roman" w:hAnsi="Times New Roman" w:cs="Times New Roman"/>
-            <w:color w:val="0000FF"/>
-            <w:kern w:val="0"/>
-            <w:u w:val="single"/>
-            <w:lang w:val="en-GB" w:eastAsia="en-GB"/>
-            <w14:ligatures w14:val="none"/>
-          </w:rPr>
-          <w:t>https://pypi.org/project/mediacloud/</w:t>
-        </w:r>
-      </w:hyperlink>
-    </w:p>
-    <w:p>
-      <w:pPr>
-        <w:numPr>
-          <w:ilvl w:val="0"/>
-          <w:numId w:val="3"/>
-        </w:numPr>
-        <w:spacing w:before="100" w:beforeAutospacing="1" w:after="100" w:afterAutospacing="1" w:line="240" w:lineRule="auto"/>
-        <w:rPr>
-          <w:rFonts w:ascii="Times New Roman" w:eastAsia="Times New Roman" w:hAnsi="Times New Roman" w:cs="Times New Roman"/>
-          <w:kern w:val="0"/>
-          <w:lang w:val="en-GB" w:eastAsia="en-GB"/>
-          <w14:ligatures w14:val="none"/>
-        </w:rPr>
-      </w:pPr>
-      <w:r>
-        <w:rPr>
-          <w:rFonts w:ascii="Times New Roman" w:eastAsia="Times New Roman" w:hAnsi="Times New Roman" w:cs="Times New Roman"/>
-          <w:b/>
-          <w:bCs/>
-          <w:kern w:val="0"/>
-          <w:lang w:val="en-GB" w:eastAsia="en-GB"/>
-          <w14:ligatures w14:val="none"/>
-        </w:rPr>
-        <w:t>bertopic v0.17.4</w:t>
-      </w:r>
-      <w:r>
-        <w:rPr>
-          <w:rFonts w:ascii="Times New Roman" w:eastAsia="Times New Roman" w:hAnsi="Times New Roman" w:cs="Times New Roman"/>
-          <w:kern w:val="0"/>
-          <w:lang w:val="en-GB" w:eastAsia="en-GB"/>
-          <w14:ligatures w14:val="none"/>
-        </w:rPr>
-        <w:t xml:space="preserve"> — GitHub: </w:t>
-      </w:r>
-      <w:hyperlink r:id="rId15" w:history="1">
-        <w:r>
-          <w:rPr>
-            <w:rFonts w:ascii="Times New Roman" w:eastAsia="Times New Roman" w:hAnsi="Times New Roman" w:cs="Times New Roman"/>
-            <w:color w:val="0000FF"/>
-            <w:kern w:val="0"/>
-            <w:u w:val="single"/>
-            <w:lang w:val="en-GB" w:eastAsia="en-GB"/>
-            <w14:ligatures w14:val="none"/>
-          </w:rPr>
-          <w:t>https://github.com/MaartenGr/BERTopic</w:t>
-        </w:r>
-      </w:hyperlink>
-      <w:r>
-        <w:rPr>
-          <w:rFonts w:ascii="Times New Roman" w:eastAsia="Times New Roman" w:hAnsi="Times New Roman" w:cs="Times New Roman"/>
-          <w:kern w:val="0"/>
-          <w:lang w:val="en-GB" w:eastAsia="en-GB"/>
-          <w14:ligatures w14:val="none"/>
-        </w:rPr>
-        <w:t xml:space="preserve"> · Paper: Grootendorst, M. (2022). </w:t>
-      </w:r>
-      <w:r>
-        <w:rPr>
-          <w:rFonts w:ascii="Times New Roman" w:eastAsia="Times New Roman" w:hAnsi="Times New Roman" w:cs="Times New Roman"/>
-          <w:i/>
-          <w:iCs/>
-          <w:kern w:val="0"/>
-          <w:lang w:val="en-GB" w:eastAsia="en-GB"/>
-          <w14:ligatures w14:val="none"/>
-        </w:rPr>
-        <w:t>BERTopic: Neural topic modeling with a class-based TF-IDF procedure</w:t>
-      </w:r>
-      <w:r>
-        <w:rPr>
-          <w:rFonts w:ascii="Times New Roman" w:eastAsia="Times New Roman" w:hAnsi="Times New Roman" w:cs="Times New Roman"/>
-          <w:kern w:val="0"/>
-          <w:lang w:val="en-GB" w:eastAsia="en-GB"/>
-          <w14:ligatures w14:val="none"/>
-        </w:rPr>
-        <w:t xml:space="preserve">. arXiv:2203.05794 — </w:t>
-      </w:r>
-      <w:hyperlink r:id="rId16" w:history="1">
-        <w:r>
-          <w:rPr>
-            <w:rFonts w:ascii="Times New Roman" w:eastAsia="Times New Roman" w:hAnsi="Times New Roman" w:cs="Times New Roman"/>
-            <w:color w:val="0000FF"/>
-            <w:kern w:val="0"/>
-            <w:u w:val="single"/>
-            <w:lang w:val="en-GB" w:eastAsia="en-GB"/>
-            <w14:ligatures w14:val="none"/>
-          </w:rPr>
-          <w:t>https://arxiv.org/abs/2203.05794</w:t>
-        </w:r>
-      </w:hyperlink>
-    </w:p>
-    <w:p>
-      <w:pPr>
-        <w:numPr>
-          <w:ilvl w:val="0"/>
-          <w:numId w:val="3"/>
-        </w:numPr>
-        <w:spacing w:before="100" w:beforeAutospacing="1" w:after="100" w:afterAutospacing="1" w:line="240" w:lineRule="auto"/>
-        <w:rPr>
-          <w:rFonts w:ascii="Times New Roman" w:eastAsia="Times New Roman" w:hAnsi="Times New Roman" w:cs="Times New Roman"/>
-          <w:kern w:val="0"/>
-          <w:lang w:val="en-GB" w:eastAsia="en-GB"/>
-          <w14:ligatures w14:val="none"/>
-        </w:rPr>
-      </w:pPr>
-      <w:r>
-        <w:rPr>
-          <w:rFonts w:ascii="Times New Roman" w:eastAsia="Times New Roman" w:hAnsi="Times New Roman" w:cs="Times New Roman"/>
-          <w:b/>
-          <w:bCs/>
-          <w:kern w:val="0"/>
-          <w:lang w:val="en-GB" w:eastAsia="en-GB"/>
-          <w14:ligatures w14:val="none"/>
-        </w:rPr>
-        <w:t>Sentence Transformers v3.0.1</w:t>
-      </w:r>
-      <w:r>
-        <w:rPr>
-          <w:rFonts w:ascii="Times New Roman" w:eastAsia="Times New Roman" w:hAnsi="Times New Roman" w:cs="Times New Roman"/>
-          <w:kern w:val="0"/>
-          <w:lang w:val="en-GB" w:eastAsia="en-GB"/>
-          <w14:ligatures w14:val="none"/>
-        </w:rPr>
-        <w:t xml:space="preserve"> — GitHub: </w:t>
-      </w:r>
-      <w:hyperlink r:id="rId17" w:history="1">
-        <w:r>
-          <w:rPr>
-            <w:rFonts w:ascii="Times New Roman" w:eastAsia="Times New Roman" w:hAnsi="Times New Roman" w:cs="Times New Roman"/>
-            <w:color w:val="0000FF"/>
-            <w:kern w:val="0"/>
-            <w:u w:val="single"/>
-            <w:lang w:val="en-GB" w:eastAsia="en-GB"/>
-            <w14:ligatures w14:val="none"/>
-          </w:rPr>
-          <w:t>https://github.com/UKPLab/sentence-transformers</w:t>
-        </w:r>
-      </w:hyperlink>
-      <w:r>
-        <w:rPr>
-          <w:rFonts w:ascii="Times New Roman" w:eastAsia="Times New Roman" w:hAnsi="Times New Roman" w:cs="Times New Roman"/>
-          <w:kern w:val="0"/>
-          <w:lang w:val="en-GB" w:eastAsia="en-GB"/>
-          <w14:ligatures w14:val="none"/>
-        </w:rPr>
-        <w:t xml:space="preserve"> · Paper: Reimers &amp; Gurevych (2019), </w:t>
-      </w:r>
-      <w:r>
-        <w:rPr>
-          <w:rFonts w:ascii="Times New Roman" w:eastAsia="Times New Roman" w:hAnsi="Times New Roman" w:cs="Times New Roman"/>
-          <w:i/>
-          <w:iCs/>
-          <w:kern w:val="0"/>
-          <w:lang w:val="en-GB" w:eastAsia="en-GB"/>
-          <w14:ligatures w14:val="none"/>
-        </w:rPr>
-        <w:t>Sentence-BERT</w:t>
-      </w:r>
-      <w:r>
-        <w:rPr>
-          <w:rFonts w:ascii="Times New Roman" w:eastAsia="Times New Roman" w:hAnsi="Times New Roman" w:cs="Times New Roman"/>
-          <w:kern w:val="0"/>
-          <w:lang w:val="en-GB" w:eastAsia="en-GB"/>
-          <w14:ligatures w14:val="none"/>
-        </w:rPr>
-        <w:t xml:space="preserve">, arXiv:1908.10084 — </w:t>
-      </w:r>
-      <w:hyperlink r:id="rId18" w:history="1">
-        <w:r>
-          <w:rPr>
-            <w:rFonts w:ascii="Times New Roman" w:eastAsia="Times New Roman" w:hAnsi="Times New Roman" w:cs="Times New Roman"/>
-            <w:color w:val="0000FF"/>
-            <w:kern w:val="0"/>
-            <w:u w:val="single"/>
-            <w:lang w:val="en-GB" w:eastAsia="en-GB"/>
-            <w14:ligatures w14:val="none"/>
-          </w:rPr>
-          <w:t>https://arxiv.org/abs/1908.10084</w:t>
-        </w:r>
-      </w:hyperlink>
-    </w:p>
-    <w:p>
-      <w:pPr>
-        <w:numPr>
-          <w:ilvl w:val="0"/>
-          <w:numId w:val="3"/>
-        </w:numPr>
-        <w:spacing w:before="100" w:beforeAutospacing="1" w:after="100" w:afterAutospacing="1" w:line="240" w:lineRule="auto"/>
-        <w:rPr>
-          <w:rFonts w:ascii="Times New Roman" w:eastAsia="Times New Roman" w:hAnsi="Times New Roman" w:cs="Times New Roman"/>
-          <w:kern w:val="0"/>
-          <w:lang w:val="en-GB" w:eastAsia="en-GB"/>
-          <w14:ligatures w14:val="none"/>
-        </w:rPr>
-      </w:pPr>
-      <w:r>
-        <w:rPr>
-          <w:rFonts w:ascii="Times New Roman" w:eastAsia="Times New Roman" w:hAnsi="Times New Roman" w:cs="Times New Roman"/>
-          <w:b/>
-          <w:bCs/>
-          <w:kern w:val="0"/>
-          <w:lang w:val="en-GB" w:eastAsia="en-GB"/>
-          <w14:ligatures w14:val="none"/>
-        </w:rPr>
-        <w:t>Paraphrase Multilingual MPNet v2 model</w:t>
-      </w:r>
-      <w:r>
-        <w:rPr>
-          <w:rFonts w:ascii="Times New Roman" w:eastAsia="Times New Roman" w:hAnsi="Times New Roman" w:cs="Times New Roman"/>
-          <w:kern w:val="0"/>
-          <w:lang w:val="en-GB" w:eastAsia="en-GB"/>
-          <w14:ligatures w14:val="none"/>
-        </w:rPr>
-        <w:t xml:space="preserve"> — Model card: </w:t>
-      </w:r>
-      <w:hyperlink r:id="rId19" w:history="1">
-        <w:r>
-          <w:rPr>
-            <w:rFonts w:ascii="Times New Roman" w:eastAsia="Times New Roman" w:hAnsi="Times New Roman" w:cs="Times New Roman"/>
-            <w:color w:val="0000FF"/>
-            <w:kern w:val="0"/>
-            <w:u w:val="single"/>
-            <w:lang w:val="en-GB" w:eastAsia="en-GB"/>
-            <w14:ligatures w14:val="none"/>
-          </w:rPr>
-          <w:t>https://huggingface.co/sentence-transformers/paraphrase-multilingual-mpnet-base-v2</w:t>
-        </w:r>
-      </w:hyperlink>
-    </w:p>
-    <w:p>
-      <w:pPr>
-        <w:numPr>
-          <w:ilvl w:val="0"/>
-          <w:numId w:val="3"/>
-        </w:numPr>
-        <w:spacing w:before="100" w:beforeAutospacing="1" w:after="100" w:afterAutospacing="1" w:line="240" w:lineRule="auto"/>
-        <w:rPr>
-          <w:rFonts w:ascii="Times New Roman" w:eastAsia="Times New Roman" w:hAnsi="Times New Roman" w:cs="Times New Roman"/>
-          <w:kern w:val="0"/>
-          <w:lang w:val="en-GB" w:eastAsia="en-GB"/>
-          <w14:ligatures w14:val="none"/>
-        </w:rPr>
-      </w:pPr>
-      <w:r>
-        <w:rPr>
-          <w:rFonts w:ascii="Times New Roman" w:eastAsia="Times New Roman" w:hAnsi="Times New Roman" w:cs="Times New Roman"/>
-          <w:b/>
-          <w:bCs/>
-          <w:kern w:val="0"/>
-          <w:lang w:val="en-GB" w:eastAsia="en-GB"/>
-          <w14:ligatures w14:val="none"/>
-        </w:rPr>
-        <w:t>spaCy v3.8.14</w:t>
-      </w:r>
-      <w:r>
-        <w:rPr>
-          <w:rFonts w:ascii="Times New Roman" w:eastAsia="Times New Roman" w:hAnsi="Times New Roman" w:cs="Times New Roman"/>
-          <w:kern w:val="0"/>
-          <w:lang w:val="en-GB" w:eastAsia="en-GB"/>
-          <w14:ligatures w14:val="none"/>
-        </w:rPr>
-        <w:t xml:space="preserve"> — Site/citation: </w:t>
-      </w:r>
-      <w:hyperlink r:id="rId20" w:history="1">
-        <w:r>
-          <w:rPr>
-            <w:rFonts w:ascii="Times New Roman" w:eastAsia="Times New Roman" w:hAnsi="Times New Roman" w:cs="Times New Roman"/>
-            <w:color w:val="0000FF"/>
-            <w:kern w:val="0"/>
-            <w:u w:val="single"/>
-            <w:lang w:val="en-GB" w:eastAsia="en-GB"/>
-            <w14:ligatures w14:val="none"/>
-          </w:rPr>
-          <w:t>https://spacy.io</w:t>
-        </w:r>
-      </w:hyperlink>
-      <w:r>
-        <w:rPr>
-          <w:rFonts w:ascii="Times New Roman" w:eastAsia="Times New Roman" w:hAnsi="Times New Roman" w:cs="Times New Roman"/>
-          <w:kern w:val="0"/>
-          <w:lang w:val="en-GB" w:eastAsia="en-GB"/>
-          <w14:ligatures w14:val="none"/>
-        </w:rPr>
-        <w:t xml:space="preserve"> · Zenodo DOI (Honnibal, Montani, Van Landeghem &amp; Boyd, 2020): </w:t>
-      </w:r>
-      <w:hyperlink r:id="rId21" w:history="1">
-        <w:r>
-          <w:rPr>
-            <w:rFonts w:ascii="Times New Roman" w:eastAsia="Times New Roman" w:hAnsi="Times New Roman" w:cs="Times New Roman"/>
-            <w:color w:val="0000FF"/>
-            <w:kern w:val="0"/>
-            <w:u w:val="single"/>
-            <w:lang w:val="en-GB" w:eastAsia="en-GB"/>
-            <w14:ligatures w14:val="none"/>
-          </w:rPr>
-          <w:t>https://doi.org/10.5281/zenodo.1212303</w:t>
-        </w:r>
-      </w:hyperlink>
-    </w:p>
-    <w:p>
-      <w:pPr>
-        <w:numPr>
-          <w:ilvl w:val="0"/>
-          <w:numId w:val="3"/>
-        </w:numPr>
-        <w:spacing w:before="100" w:beforeAutospacing="1" w:after="100" w:afterAutospacing="1" w:line="240" w:lineRule="auto"/>
-        <w:rPr>
-          <w:rFonts w:ascii="Times New Roman" w:eastAsia="Times New Roman" w:hAnsi="Times New Roman" w:cs="Times New Roman"/>
-          <w:kern w:val="0"/>
-          <w:lang w:val="en-GB" w:eastAsia="en-GB"/>
-          <w14:ligatures w14:val="none"/>
-        </w:rPr>
-      </w:pPr>
-      <w:r>
-        <w:rPr>
-          <w:rFonts w:ascii="Times New Roman" w:eastAsia="Times New Roman" w:hAnsi="Times New Roman" w:cs="Times New Roman"/>
-          <w:b/>
-          <w:bCs/>
-          <w:kern w:val="0"/>
-          <w:lang w:val="en-GB" w:eastAsia="en-GB"/>
-          <w14:ligatures w14:val="none"/>
-        </w:rPr>
-        <w:t>KeyBERT</w:t>
-      </w:r>
-      <w:r>
-        <w:rPr>
-          <w:rFonts w:ascii="Times New Roman" w:eastAsia="Times New Roman" w:hAnsi="Times New Roman" w:cs="Times New Roman"/>
-          <w:kern w:val="0"/>
-          <w:lang w:val="en-GB" w:eastAsia="en-GB"/>
-          <w14:ligatures w14:val="none"/>
-        </w:rPr>
-        <w:t xml:space="preserve"> — GitHub: </w:t>
-      </w:r>
-      <w:hyperlink r:id="rId22" w:history="1">
-        <w:r>
-          <w:rPr>
-            <w:rFonts w:ascii="Times New Roman" w:eastAsia="Times New Roman" w:hAnsi="Times New Roman" w:cs="Times New Roman"/>
-            <w:color w:val="0000FF"/>
-            <w:kern w:val="0"/>
-            <w:u w:val="single"/>
-            <w:lang w:val="en-GB" w:eastAsia="en-GB"/>
-            <w14:ligatures w14:val="none"/>
-          </w:rPr>
-          <w:t>https://github.com/MaartenGr/KeyBERT</w:t>
-        </w:r>
-      </w:hyperlink>
-      <w:r>
-        <w:rPr>
-          <w:rFonts w:ascii="Times New Roman" w:eastAsia="Times New Roman" w:hAnsi="Times New Roman" w:cs="Times New Roman"/>
-          <w:kern w:val="0"/>
-          <w:lang w:val="en-GB" w:eastAsia="en-GB"/>
-          <w14:ligatures w14:val="none"/>
-        </w:rPr>
-        <w:t xml:space="preserve"> (no formal paper; cite the repo/Zenodo record if your citation manager needs a DOI, check the repo's </w:t>
-      </w:r>
-      <w:r>
-        <w:rPr>
-          <w:rFonts w:ascii="Courier New" w:eastAsia="Times New Roman" w:hAnsi="Courier New" w:cs="Courier New"/>
-          <w:kern w:val="0"/>
-          <w:sz w:val="20"/>
-          <w:szCs w:val="20"/>
-          <w:lang w:val="en-GB" w:eastAsia="en-GB"/>
-          <w14:ligatures w14:val="none"/>
-        </w:rPr>
-        <w:t>CITATION.cff</w:t>
-      </w:r>
-      <w:r>
-        <w:rPr>
-          <w:rFonts w:ascii="Times New Roman" w:eastAsia="Times New Roman" w:hAnsi="Times New Roman" w:cs="Times New Roman"/>
-          <w:kern w:val="0"/>
-          <w:lang w:val="en-GB" w:eastAsia="en-GB"/>
-          <w14:ligatures w14:val="none"/>
-        </w:rPr>
-        <w:t>)</w:t>
-      </w:r>
-    </w:p>
-    <w:p>
-      <w:pPr>
-        <w:rPr>
-          <w:lang w:val="en-GB"/>
-        </w:rPr>
-      </w:pPr>
-    </w:p>
-    <w:p>
-      <w:pPr>
-        <w:rPr>
-          <w:lang w:val="en-GB"/>
-        </w:rPr>
-      </w:pPr>
+        <w:rPr>
+          <w:lang w:val="en-GB"/>
+        </w:rPr>
+      </w:pPr>
+    </w:p>
+    <w:p>
+      <w:pPr>
+        <w:pStyle w:val="Bibliography"/>
+        <w:rPr>
+          <w:lang w:val="en-GB"/>
+        </w:rPr>
+      </w:pPr>
+      <w:r>
+        <w:rPr>
+          <w:lang w:val="en-GB"/>
+        </w:rPr>
+        <w:fldChar w:fldCharType="begin"/>
+      </w:r>
+      <w:r>
+        <w:rPr>
+          <w:lang w:val="en-GB"/>
+        </w:rPr>
+        <w:instrText xml:space="preserve"> ADDIN ZOTERO_BIBL {"uncited":[],"omitted":[],"custom":[]} CSL_BIBLIOGRAPHY </w:instrText>
+      </w:r>
+      <w:r>
+        <w:rPr>
+          <w:lang w:val="en-GB"/>
+        </w:rPr>
+        <w:fldChar w:fldCharType="separate"/>
+      </w:r>
+      <w:r>
+        <w:rPr>
+          <w:lang w:val="en-GB"/>
+        </w:rPr>
+        <w:t>1.</w:t>
+      </w:r>
+      <w:r>
+        <w:rPr>
+          <w:lang w:val="en-GB"/>
+        </w:rPr>
+        <w:tab/>
+        <w:t>Python Software Foundation. Python [Internet]. Python Software Foundation; 2026 [cited 2026 Jul 14]. Available from: https://www.python.org/</w:t>
+      </w:r>
+    </w:p>
+    <w:p>
+      <w:pPr>
+        <w:pStyle w:val="Bibliography"/>
+        <w:rPr>
+          <w:lang w:val="en-GB"/>
+        </w:rPr>
+      </w:pPr>
+      <w:r>
+        <w:rPr>
+          <w:lang w:val="en-GB"/>
+        </w:rPr>
+        <w:t>2.</w:t>
+      </w:r>
+      <w:r>
+        <w:rPr>
+          <w:lang w:val="en-GB"/>
+        </w:rPr>
+        <w:tab/>
+        <w:t>European Centre for Disease Prevention and Control (ECDC). Surveillance Atlas of Infectious Diseases [Internet]. Stockholm; [cited 2026 Jun 29]. Available from: https://atlas.ecdc.europa.eu/public/index.aspx</w:t>
+      </w:r>
+    </w:p>
+    <w:p>
+      <w:pPr>
+        <w:pStyle w:val="Bibliography"/>
+        <w:rPr>
+          <w:lang w:val="en-GB"/>
+        </w:rPr>
+      </w:pPr>
+      <w:r>
+        <w:t>3.</w:t>
+      </w:r>
+      <w:r>
+        <w:tab/>
+        <w:t xml:space="preserve">sdil87. sdil87/trendspy: v0.1.6 [Python] [Internet]. </w:t>
+      </w:r>
+      <w:r>
+        <w:rPr>
+          <w:lang w:val="en-GB"/>
+        </w:rPr>
+        <w:t>2024 [cited 2026 Jul 14]. Available from: https://github.com/sdil87/trendspy/releases/tag/v0.1.6</w:t>
+      </w:r>
+    </w:p>
+    <w:p>
+      <w:pPr>
+        <w:pStyle w:val="Bibliography"/>
+        <w:rPr>
+          <w:lang w:val="en-GB"/>
+        </w:rPr>
+      </w:pPr>
+      <w:r>
+        <w:rPr>
+          <w:lang w:val="en-GB"/>
+        </w:rPr>
+        <w:t>4.</w:t>
+      </w:r>
+      <w:r>
+        <w:rPr>
+          <w:lang w:val="en-GB"/>
+        </w:rPr>
+        <w:tab/>
+        <w:t>Wikimedia Foundation. Wikidata [Internet]. 2026 [cited 2026 Jul 14]. Available from: https://www.wikidata.org/</w:t>
+      </w:r>
+    </w:p>
+    <w:p>
+      <w:pPr>
+        <w:pStyle w:val="Bibliography"/>
+        <w:rPr>
+          <w:lang w:val="en-GB"/>
+        </w:rPr>
+      </w:pPr>
+      <w:r>
+        <w:rPr>
+          <w:lang w:val="en-GB"/>
+        </w:rPr>
+        <w:t>5.</w:t>
+      </w:r>
+      <w:r>
+        <w:rPr>
+          <w:lang w:val="en-GB"/>
+        </w:rPr>
+        <w:tab/>
+        <w:t>Wikimedia Foundation. Wikimedia Analytics API [Internet]. 2026 [cited 2026 Jul 14]. Available from: https://doc.wikimedia.org/generated-data-platform/aqs/analytics-api/</w:t>
+      </w:r>
+    </w:p>
+    <w:p>
+      <w:pPr>
+        <w:pStyle w:val="Bibliography"/>
+        <w:rPr>
+          <w:lang w:val="en-GB"/>
+        </w:rPr>
+      </w:pPr>
+      <w:r>
+        <w:rPr>
+          <w:lang w:val="en-GB"/>
+        </w:rPr>
+        <w:t>6.</w:t>
+      </w:r>
+      <w:r>
+        <w:rPr>
+          <w:lang w:val="en-GB"/>
+        </w:rPr>
+        <w:tab/>
+        <w:t>Roberts H, Bhargava R, Valiukas L, Jen D, Malik MM, Bishop CS, et al. Media Cloud: Massive Open Source Collection of Global News on the Open Web. Proc Int AAAI Conf Web Soc Media. 2021 May 22;15:1034–45. doi:10.1609/icwsm.v15i1.18127</w:t>
+      </w:r>
+    </w:p>
+    <w:p>
+      <w:pPr>
+        <w:pStyle w:val="Bibliography"/>
+        <w:rPr>
+          <w:lang w:val="en-GB"/>
+        </w:rPr>
+      </w:pPr>
+      <w:r>
+        <w:rPr>
+          <w:lang w:val="en-GB"/>
+        </w:rPr>
+        <w:t>7.</w:t>
+      </w:r>
+      <w:r>
+        <w:rPr>
+          <w:lang w:val="en-GB"/>
+        </w:rPr>
+        <w:tab/>
+        <w:t>MediaCloud. MediaCloud Python API Client [Python] [Internet]. Media Cloud; 2026 [cited 2026 Jul 14]. Available from: https://github.com/mediacloud/api-client/releases/tag/v5.1.0</w:t>
+      </w:r>
+    </w:p>
+    <w:p>
+      <w:pPr>
+        <w:pStyle w:val="Bibliography"/>
+        <w:rPr>
+          <w:lang w:val="en-GB"/>
+        </w:rPr>
+      </w:pPr>
+      <w:r>
+        <w:t>8.</w:t>
+      </w:r>
+      <w:r>
+        <w:tab/>
+        <w:t xml:space="preserve">daniel servén, Charlie Brummitt, Franz Király, JodesL, Denise Schmitz, Zachariah Carmichael, et al. dswah/pyGAM: v0.12.0 [Internet]. </w:t>
+      </w:r>
+      <w:r>
+        <w:rPr>
+          <w:lang w:val="en-GB"/>
+        </w:rPr>
+        <w:t xml:space="preserve">Zenodo; 2025 [cited 2026 Jul </w:t>
+      </w:r>
+      <w:r>
+        <w:rPr>
+          <w:lang w:val="en-GB"/>
+        </w:rPr>
+        <w:lastRenderedPageBreak/>
+        <w:t>14]. Available from: https://zenodo.org/doi/10.5281/zenodo.1208723 doi:10.5281/ZENODO.1208723</w:t>
+      </w:r>
+    </w:p>
+    <w:p>
+      <w:pPr>
+        <w:pStyle w:val="Bibliography"/>
+        <w:rPr>
+          <w:lang w:val="en-GB"/>
+        </w:rPr>
+      </w:pPr>
+      <w:r>
+        <w:rPr>
+          <w:lang w:val="en-GB"/>
+        </w:rPr>
+        <w:t>9.</w:t>
+      </w:r>
+      <w:r>
+        <w:rPr>
+          <w:lang w:val="en-GB"/>
+        </w:rPr>
+        <w:tab/>
+        <w:t>Grootendorst M. BERTopic: Neural topic modeling with a class-based TF-IDF procedure [Internet]. arXiv; 2022 [cited 2026 Jul 14]. Available from: https://arxiv.org/abs/2203.05794 doi:10.48550/ARXIV.2203.05794</w:t>
+      </w:r>
+    </w:p>
+    <w:p>
+      <w:pPr>
+        <w:pStyle w:val="Bibliography"/>
+        <w:rPr>
+          <w:lang w:val="en-GB"/>
+        </w:rPr>
+      </w:pPr>
+      <w:r>
+        <w:rPr>
+          <w:lang w:val="en-GB"/>
+        </w:rPr>
+        <w:t>10.</w:t>
+      </w:r>
+      <w:r>
+        <w:rPr>
+          <w:lang w:val="en-GB"/>
+        </w:rPr>
+        <w:tab/>
+        <w:t>Reimers N, Gurevych I. Sentence-BERT: Sentence Embeddings using Siamese BERT-Networks [Internet]. Software: Sentence Transformers v3.0.1, https://github.com/UKPLab/sentence-transformers: arXiv; 2019 [cited 2026 Jul 14]. Available from: https://arxiv.org/abs/1908.10084 doi:10.48550/ARXIV.1908.10084</w:t>
+      </w:r>
+    </w:p>
+    <w:p>
+      <w:pPr>
+        <w:pStyle w:val="Bibliography"/>
+        <w:rPr>
+          <w:lang w:val="en-GB"/>
+        </w:rPr>
+      </w:pPr>
+      <w:r>
+        <w:rPr>
+          <w:lang w:val="en-GB"/>
+        </w:rPr>
+        <w:t>11.</w:t>
+      </w:r>
+      <w:r>
+        <w:rPr>
+          <w:lang w:val="en-GB"/>
+        </w:rPr>
+        <w:tab/>
+        <w:t>Ines Montani, Matthew Honnibal, Adriane Boyd, Sofie Van Landeghem, Henning Peters. explosion/spaCy: v3.7.2: Fixes for APIs and requirements [Internet]. Zenodo; 2023 [cited 2026 Jul 14]. Available from: https://zenodo.org/doi/10.5281/zenodo.1212303 doi:10.5281/ZENODO.1212303</w:t>
+      </w:r>
+    </w:p>
+    <w:p>
+      <w:pPr>
+        <w:pStyle w:val="Bibliography"/>
+        <w:rPr>
+          <w:lang w:val="en-GB"/>
+        </w:rPr>
+      </w:pPr>
+      <w:r>
+        <w:t>12.</w:t>
+      </w:r>
+      <w:r>
+        <w:tab/>
+        <w:t xml:space="preserve">Grootendorst M. MaartenGr/KeyBERT: BibTeX [Internet]. </w:t>
+      </w:r>
+      <w:r>
+        <w:rPr>
+          <w:lang w:val="en-GB"/>
+        </w:rPr>
+        <w:t>Zenodo; 2021 [cited 2026 Jul 14]. Available from: https://zenodo.org/record/4461265 doi:10.5281/ZENODO.4461265</w:t>
+      </w:r>
+    </w:p>
+    <w:p>
+      <w:pPr>
+        <w:pStyle w:val="Bibliography"/>
+        <w:rPr>
+          <w:lang w:val="en-GB"/>
+        </w:rPr>
+      </w:pPr>
+      <w:r>
+        <w:rPr>
+          <w:lang w:val="en-GB"/>
+        </w:rPr>
+        <w:t>13.</w:t>
+      </w:r>
+      <w:r>
+        <w:rPr>
+          <w:lang w:val="en-GB"/>
+        </w:rPr>
+        <w:tab/>
+        <w:t>Carbonell J, Goldstein J. The use of MMR, diversity-based reranking for reordering documents and producing summaries. In: Proceedings of the 21st annual international ACM SIGIR conference on Research and development in information retrieval [Internet]. Melbourne Australia: ACM; 1998 [cited 2026 Jul 14]. p. 335–6. Available from: https://dl.acm.org/doi/10.1145/290941.291025 doi:10.1145/290941.291025</w:t>
+      </w:r>
+    </w:p>
+    <w:p>
+      <w:pPr>
+        <w:rPr>
+          <w:lang w:val="en-GB"/>
+        </w:rPr>
+      </w:pPr>
+      <w:r>
+        <w:rPr>
+          <w:lang w:val="en-GB"/>
+        </w:rPr>
+        <w:fldChar w:fldCharType="end"/>
+      </w:r>
     </w:p>
     <w:p>
       <w:pPr>
@@ -4042,7 +4641,6 @@
         <w:rPr>
           <w:lang w:val="en-GB"/>
         </w:rPr>
-        <w:lastRenderedPageBreak/>
         <w:t>Wiki pageviews:</w:t>
       </w:r>
     </w:p>
@@ -4253,6 +4851,7 @@
           <w:lang w:val="en-GB" w:eastAsia="en-GB"/>
           <w14:ligatures w14:val="none"/>
         </w:rPr>
+        <w:lastRenderedPageBreak/>
         <w:t xml:space="preserve">    </w:t>
       </w:r>
       <w:r>
@@ -4826,7 +5425,6 @@
         <w:rPr>
           <w:lang w:val="en-GB"/>
         </w:rPr>
-        <w:lastRenderedPageBreak/>
         <w:t>Total of 30597 stories fetched, 21044 (68.8%) successfully retrieved full text, 9553 (31.2%) failed due to copyright restrictions. Percentage of retrieved stories across countries and subtypes fairly consistent</w:t>
       </w:r>
     </w:p>
@@ -4845,7 +5443,14 @@
         <w:rPr>
           <w:lang w:val="en-GB"/>
         </w:rPr>
-        <w:t>Removed boilerplate phrases, links, email addresses, social media handles, photo and image captions, news wire tags, datelines, repeated white space from texts. Normalised Unicode punctuation to prevent mojibake. Applied 200 character minimum length filter to remove downloaded text that aren’t real news stories</w:t>
+        <w:t xml:space="preserve">Removed boilerplate phrases, links, email addresses, social media handles, photo and image captions, news wire tags, datelines, repeated white space from texts. Normalised Unicode punctuation to prevent mojibake. Applied 200 </w:t>
+      </w:r>
+      <w:r>
+        <w:rPr>
+          <w:lang w:val="en-GB"/>
+        </w:rPr>
+        <w:lastRenderedPageBreak/>
+        <w:t>character minimum length filter to remove downloaded text that aren’t real news stories</w:t>
       </w:r>
     </w:p>
     <w:p>
@@ -7185,7 +7790,6 @@
         <w:rPr>
           <w:lang w:val="en-GB"/>
         </w:rPr>
-        <w:lastRenderedPageBreak/>
         <w:t>Chikungunya: 18 topics</w:t>
       </w:r>
     </w:p>
@@ -7294,6 +7898,7 @@
         <w:rPr>
           <w:lang w:val="en-GB"/>
         </w:rPr>
+        <w:lastRenderedPageBreak/>
         <w:t>anchor: 14 topics</w:t>
       </w:r>
     </w:p>
@@ -7456,42 +8061,42 @@
         <w:rPr>
           <w:lang w:val="en-GB"/>
         </w:rPr>
-        <w:t>2026-07-03 18:53:20,073 - BERTopic - WARNING: You are saving a BERTopic model without explicitly defining an embedding model.If you are using a sentence-transformers model or a HuggingFace model supportedby sentence-</w:t>
+        <w:t>2026-07-03 18:53:20,073 - BERTopic - WARNING: You are saving a BERTopic model without explicitly defining an embedding model.If you are using a sentence-transformers model or a HuggingFace model supportedby sentence-transformers, please save the model by using a pointer towards that model.For example, `save_embedding_model='sentence-transformers/all-mpnet-base-v2'`</w:t>
+      </w:r>
+    </w:p>
+    <w:p>
+      <w:pPr>
+        <w:pStyle w:val="ListParagraph"/>
+        <w:rPr>
+          <w:lang w:val="en-GB"/>
+        </w:rPr>
+      </w:pPr>
+      <w:r>
+        <w:rPr>
+          <w:lang w:val="en-GB"/>
+        </w:rPr>
+        <w:t>Usutu: merged 4 groups, 13 topics remain</w:t>
+      </w:r>
+    </w:p>
+    <w:p>
+      <w:pPr>
+        <w:pStyle w:val="ListParagraph"/>
+        <w:rPr>
+          <w:lang w:val="en-GB"/>
+        </w:rPr>
+      </w:pPr>
+      <w:r>
+        <w:rPr>
+          <w:lang w:val="en-GB"/>
+        </w:rPr>
+        <w:t xml:space="preserve">2026-07-03 18:53:46,090 - BERTopic - WARNING: You are saving a BERTopic model without explicitly defining an embedding model.If you are using a </w:t>
       </w:r>
       <w:r>
         <w:rPr>
           <w:lang w:val="en-GB"/>
         </w:rPr>
         <w:lastRenderedPageBreak/>
-        <w:t>transformers, please save the model by using a pointer towards that model.For example, `save_embedding_model='sentence-transformers/all-mpnet-base-v2'`</w:t>
-      </w:r>
-    </w:p>
-    <w:p>
-      <w:pPr>
-        <w:pStyle w:val="ListParagraph"/>
-        <w:rPr>
-          <w:lang w:val="en-GB"/>
-        </w:rPr>
-      </w:pPr>
-      <w:r>
-        <w:rPr>
-          <w:lang w:val="en-GB"/>
-        </w:rPr>
-        <w:t>Usutu: merged 4 groups, 13 topics remain</w:t>
-      </w:r>
-    </w:p>
-    <w:p>
-      <w:pPr>
-        <w:pStyle w:val="ListParagraph"/>
-        <w:rPr>
-          <w:lang w:val="en-GB"/>
-        </w:rPr>
-      </w:pPr>
-      <w:r>
-        <w:rPr>
-          <w:lang w:val="en-GB"/>
-        </w:rPr>
-        <w:t>2026-07-03 18:53:46,090 - BERTopic - WARNING: You are saving a BERTopic model without explicitly defining an embedding model.If you are using a sentence-transformers model or a HuggingFace model supportedby sentence-transformers, please save the model by using a pointer towards that model.For example, `save_embedding_model='sentence-transformers/all-mpnet-base-v2'`</w:t>
+        <w:t>sentence-transformers model or a HuggingFace model supportedby sentence-transformers, please save the model by using a pointer towards that model.For example, `save_embedding_model='sentence-transformers/all-mpnet-base-v2'`</w:t>
       </w:r>
     </w:p>
     <w:p>
@@ -7635,42 +8240,42 @@
         <w:rPr>
           <w:lang w:val="en-GB"/>
         </w:rPr>
-        <w:t xml:space="preserve">2026-07-03 18:55:29,347 - BERTopic - WARNING: Using a custom list of topic assignments may lead to errors if topic reduction techniques are used afterwards. Make sure that manually assigning topics is the last step in the </w:t>
+        <w:t>2026-07-03 18:55:29,347 - BERTopic - WARNING: Using a custom list of topic assignments may lead to errors if topic reduction techniques are used afterwards. Make sure that manually assigning topics is the last step in the pipeline.Note that topic embeddings will also be created through weightedc-TF-IDF embeddings instead of centroid embeddings.</w:t>
+      </w:r>
+    </w:p>
+    <w:p>
+      <w:pPr>
+        <w:pStyle w:val="ListParagraph"/>
+        <w:rPr>
+          <w:lang w:val="en-GB"/>
+        </w:rPr>
+      </w:pPr>
+      <w:r>
+        <w:rPr>
+          <w:lang w:val="en-GB"/>
+        </w:rPr>
+        <w:t>Chikungunya: dropping 142 documents from 3 deleted topic(s)</w:t>
+      </w:r>
+    </w:p>
+    <w:p>
+      <w:pPr>
+        <w:pStyle w:val="ListParagraph"/>
+        <w:rPr>
+          <w:lang w:val="en-GB"/>
+        </w:rPr>
+      </w:pPr>
+      <w:r>
+        <w:rPr>
+          <w:lang w:val="en-GB"/>
+        </w:rPr>
+        <w:t>2026-07-03 18:55:57,391 - BERTopic - WARNING: You are saving a BERTopic model without explicitly defining an embedding model.If you are using a sentence-transformers model or a HuggingFace model supportedby sentence-</w:t>
       </w:r>
       <w:r>
         <w:rPr>
           <w:lang w:val="en-GB"/>
         </w:rPr>
         <w:lastRenderedPageBreak/>
-        <w:t>pipeline.Note that topic embeddings will also be created through weightedc-TF-IDF embeddings instead of centroid embeddings.</w:t>
-      </w:r>
-    </w:p>
-    <w:p>
-      <w:pPr>
-        <w:pStyle w:val="ListParagraph"/>
-        <w:rPr>
-          <w:lang w:val="en-GB"/>
-        </w:rPr>
-      </w:pPr>
-      <w:r>
-        <w:rPr>
-          <w:lang w:val="en-GB"/>
-        </w:rPr>
-        <w:t>Chikungunya: dropping 142 documents from 3 deleted topic(s)</w:t>
-      </w:r>
-    </w:p>
-    <w:p>
-      <w:pPr>
-        <w:pStyle w:val="ListParagraph"/>
-        <w:rPr>
-          <w:lang w:val="en-GB"/>
-        </w:rPr>
-      </w:pPr>
-      <w:r>
-        <w:rPr>
-          <w:lang w:val="en-GB"/>
-        </w:rPr>
-        <w:t>2026-07-03 18:55:57,391 - BERTopic - WARNING: You are saving a BERTopic model without explicitly defining an embedding model.If you are using a sentence-transformers model or a HuggingFace model supportedby sentence-transformers, please save the model by using a pointer towards that model.For example, `save_embedding_model='sentence-transformers/all-mpnet-base-v2'`</w:t>
+        <w:t>transformers, please save the model by using a pointer towards that model.For example, `save_embedding_model='sentence-transformers/all-mpnet-base-v2'`</w:t>
       </w:r>
     </w:p>
     <w:p>
@@ -7796,28 +8401,28 @@
         <w:rPr>
           <w:lang w:val="en-GB"/>
         </w:rPr>
-        <w:t xml:space="preserve">2026-07-03 18:57:00,111 - BERTopic - WARNING: You are saving a BERTopic model without explicitly defining an embedding model.If you are using a </w:t>
+        <w:t>2026-07-03 18:57:00,111 - BERTopic - WARNING: You are saving a BERTopic model without explicitly defining an embedding model.If you are using a sentence-transformers model or a HuggingFace model supportedby sentence-transformers, please save the model by using a pointer towards that model.For example, `save_embedding_model='sentence-transformers/all-mpnet-base-v2'`</w:t>
+      </w:r>
+    </w:p>
+    <w:p>
+      <w:pPr>
+        <w:pStyle w:val="ListParagraph"/>
+        <w:rPr>
+          <w:lang w:val="en-GB"/>
+        </w:rPr>
+      </w:pPr>
+      <w:r>
+        <w:rPr>
+          <w:lang w:val="en-GB"/>
+        </w:rPr>
+        <w:t xml:space="preserve">2026-07-03 18:57:00,198 - BERTopic - WARNING: Using a custom list of topic assignments may lead to errors if topic reduction techniques are used </w:t>
       </w:r>
       <w:r>
         <w:rPr>
           <w:lang w:val="en-GB"/>
         </w:rPr>
         <w:lastRenderedPageBreak/>
-        <w:t>sentence-transformers model or a HuggingFace model supportedby sentence-transformers, please save the model by using a pointer towards that model.For example, `save_embedding_model='sentence-transformers/all-mpnet-base-v2'`</w:t>
-      </w:r>
-    </w:p>
-    <w:p>
-      <w:pPr>
-        <w:pStyle w:val="ListParagraph"/>
-        <w:rPr>
-          <w:lang w:val="en-GB"/>
-        </w:rPr>
-      </w:pPr>
-      <w:r>
-        <w:rPr>
-          <w:lang w:val="en-GB"/>
-        </w:rPr>
-        <w:t>2026-07-03 18:57:00,198 - BERTopic - WARNING: Using a custom list of topic assignments may lead to errors if topic reduction techniques are used afterwards. Make sure that manually assigning topics is the last step in the pipeline.Note that topic embeddings will also be created through weightedc-TF-IDF embeddings instead of centroid embeddings.</w:t>
+        <w:t>afterwards. Make sure that manually assigning topics is the last step in the pipeline.Note that topic embeddings will also be created through weightedc-TF-IDF embeddings instead of centroid embeddings.</w:t>
       </w:r>
     </w:p>
     <w:p>
@@ -7957,91 +8562,91 @@
         <w:rPr>
           <w:lang w:val="en-GB"/>
         </w:rPr>
+        <w:t>Chikungunya: 2533 documents across 14 topics</w:t>
+      </w:r>
+    </w:p>
+    <w:p>
+      <w:pPr>
+        <w:pStyle w:val="ListParagraph"/>
+        <w:rPr>
+          <w:lang w:val="en-GB"/>
+        </w:rPr>
+      </w:pPr>
+      <w:r>
+        <w:rPr>
+          <w:lang w:val="en-GB"/>
+        </w:rPr>
+        <w:t>Culex: 2101 documents across 8 topics</w:t>
+      </w:r>
+    </w:p>
+    <w:p>
+      <w:pPr>
+        <w:pStyle w:val="ListParagraph"/>
+        <w:rPr>
+          <w:lang w:val="en-GB"/>
+        </w:rPr>
+      </w:pPr>
+      <w:r>
+        <w:rPr>
+          <w:lang w:val="en-GB"/>
+        </w:rPr>
+        <w:t>Dengue: 2546 documents across 12 topics</w:t>
+      </w:r>
+    </w:p>
+    <w:p>
+      <w:pPr>
+        <w:pStyle w:val="ListParagraph"/>
+        <w:rPr>
+          <w:lang w:val="en-GB"/>
+        </w:rPr>
+      </w:pPr>
+      <w:r>
+        <w:rPr>
+          <w:lang w:val="en-GB"/>
+        </w:rPr>
+        <w:t>Usutu: 585 documents across 10 topics</w:t>
+      </w:r>
+    </w:p>
+    <w:p>
+      <w:pPr>
+        <w:pStyle w:val="ListParagraph"/>
+        <w:rPr>
+          <w:lang w:val="en-GB"/>
+        </w:rPr>
+      </w:pPr>
+      <w:r>
+        <w:rPr>
+          <w:lang w:val="en-GB"/>
+        </w:rPr>
+        <w:t>West Nile: 1577 documents across 10 topics</w:t>
+      </w:r>
+    </w:p>
+    <w:p>
+      <w:pPr>
+        <w:pStyle w:val="ListParagraph"/>
+        <w:rPr>
+          <w:lang w:val="en-GB"/>
+        </w:rPr>
+      </w:pPr>
+      <w:r>
+        <w:rPr>
+          <w:lang w:val="en-GB"/>
+        </w:rPr>
+        <w:t>Zika: 2700 documents across 9 topics</w:t>
+      </w:r>
+    </w:p>
+    <w:p>
+      <w:pPr>
+        <w:pStyle w:val="ListParagraph"/>
+        <w:rPr>
+          <w:lang w:val="en-GB"/>
+        </w:rPr>
+      </w:pPr>
+      <w:r>
+        <w:rPr>
+          <w:lang w:val="en-GB"/>
+        </w:rPr>
         <w:lastRenderedPageBreak/>
-        <w:t>Chikungunya: 2533 documents across 14 topics</w:t>
-      </w:r>
-    </w:p>
-    <w:p>
-      <w:pPr>
-        <w:pStyle w:val="ListParagraph"/>
-        <w:rPr>
-          <w:lang w:val="en-GB"/>
-        </w:rPr>
-      </w:pPr>
-      <w:r>
-        <w:rPr>
-          <w:lang w:val="en-GB"/>
-        </w:rPr>
-        <w:t>Culex: 2101 documents across 8 topics</w:t>
-      </w:r>
-    </w:p>
-    <w:p>
-      <w:pPr>
-        <w:pStyle w:val="ListParagraph"/>
-        <w:rPr>
-          <w:lang w:val="en-GB"/>
-        </w:rPr>
-      </w:pPr>
-      <w:r>
-        <w:rPr>
-          <w:lang w:val="en-GB"/>
-        </w:rPr>
-        <w:t>Dengue: 2546 documents across 12 topics</w:t>
-      </w:r>
-    </w:p>
-    <w:p>
-      <w:pPr>
-        <w:pStyle w:val="ListParagraph"/>
-        <w:rPr>
-          <w:lang w:val="en-GB"/>
-        </w:rPr>
-      </w:pPr>
-      <w:r>
-        <w:rPr>
-          <w:lang w:val="en-GB"/>
-        </w:rPr>
-        <w:t>Usutu: 585 documents across 10 topics</w:t>
-      </w:r>
-    </w:p>
-    <w:p>
-      <w:pPr>
-        <w:pStyle w:val="ListParagraph"/>
-        <w:rPr>
-          <w:lang w:val="en-GB"/>
-        </w:rPr>
-      </w:pPr>
-      <w:r>
-        <w:rPr>
-          <w:lang w:val="en-GB"/>
-        </w:rPr>
-        <w:t>West Nile: 1577 documents across 10 topics</w:t>
-      </w:r>
-    </w:p>
-    <w:p>
-      <w:pPr>
-        <w:pStyle w:val="ListParagraph"/>
-        <w:rPr>
-          <w:lang w:val="en-GB"/>
-        </w:rPr>
-      </w:pPr>
-      <w:r>
-        <w:rPr>
-          <w:lang w:val="en-GB"/>
-        </w:rPr>
-        <w:t>Zika: 2700 documents across 9 topics</w:t>
-      </w:r>
-    </w:p>
-    <w:p>
-      <w:pPr>
-        <w:pStyle w:val="ListParagraph"/>
-        <w:rPr>
-          <w:lang w:val="en-GB"/>
-        </w:rPr>
-      </w:pPr>
-      <w:r>
-        <w:rPr>
-          <w:lang w:val="en-GB"/>
-        </w:rPr>
         <w:t>anchor: 1371 documents across 7 topics</w:t>
       </w:r>
     </w:p>
@@ -8959,6 +9564,9 @@
     <w:p>
       <w:pPr>
         <w:pStyle w:val="CommentText"/>
+        <w:rPr>
+          <w:lang w:val="en-GB"/>
+        </w:rPr>
       </w:pPr>
       <w:r>
         <w:rPr>
@@ -8967,7 +9575,16 @@
         <w:annotationRef/>
       </w:r>
       <w:r>
+        <w:rPr>
+          <w:lang w:val="en-GB"/>
+        </w:rPr>
         <w:t>More detail from Eugenia</w:t>
+      </w:r>
+      <w:r>
+        <w:rPr>
+          <w:lang w:val="en-GB"/>
+        </w:rPr>
+        <w:t xml:space="preserve"> + citation</w:t>
       </w:r>
     </w:p>
   </w:comment>
@@ -9000,34 +9617,6 @@
           <w:lang w:val="en-GB"/>
         </w:rPr>
       </w:pPr>
-    </w:p>
-  </w:comment>
-  <w:comment w:id="4" w:author="Annabell Macphee" w:date="2026-07-13T18:48:00Z" w:initials="AM">
-    <w:p>
-      <w:pPr>
-        <w:pStyle w:val="CommentText"/>
-        <w:rPr>
-          <w:lang w:val="en-GB"/>
-        </w:rPr>
-      </w:pPr>
-      <w:r>
-        <w:rPr>
-          <w:rStyle w:val="CommentReference"/>
-        </w:rPr>
-        <w:annotationRef/>
-      </w:r>
-      <w:r>
-        <w:rPr>
-          <w:lang w:val="en-GB"/>
-        </w:rPr>
-        <w:t>Included for referencing each package,</w:t>
-      </w:r>
-      <w:r>
-        <w:rPr>
-          <w:lang w:val="en-GB"/>
-        </w:rPr>
-        <w:t xml:space="preserve"> I didn’t want to do it here as I don’t think it copies over with Zotero</w:t>
-      </w:r>
     </w:p>
   </w:comment>
 </w:comments>
@@ -9039,7 +9628,6 @@
   <w15:commentEx w15:paraId="630235F8" w15:done="0"/>
   <w15:commentEx w15:paraId="125E66BF" w15:done="0"/>
   <w15:commentEx w15:paraId="0BA6A261" w15:done="0"/>
-  <w15:commentEx w15:paraId="15B21CA2" w15:done="0"/>
 </w15:commentsEx>
 </file>
 
@@ -9049,7 +9637,6 @@
   <w16cex:commentExtensible w16cex:durableId="125DBE8A" w16cex:dateUtc="2026-07-13T16:45:00Z"/>
   <w16cex:commentExtensible w16cex:durableId="6CCBC9C4" w16cex:dateUtc="2026-07-13T13:35:00Z"/>
   <w16cex:commentExtensible w16cex:durableId="19903FD4" w16cex:dateUtc="2026-07-13T13:39:00Z"/>
-  <w16cex:commentExtensible w16cex:durableId="30EF492B" w16cex:dateUtc="2026-07-13T16:48:00Z"/>
 </w16cex:commentsExtensible>
 </file>
 
@@ -9059,7 +9646,6 @@
   <w16cid:commentId w16cid:paraId="630235F8" w16cid:durableId="125DBE8A"/>
   <w16cid:commentId w16cid:paraId="125E66BF" w16cid:durableId="6CCBC9C4"/>
   <w16cid:commentId w16cid:paraId="0BA6A261" w16cid:durableId="19903FD4"/>
-  <w16cid:commentId w16cid:paraId="15B21CA2" w16cid:durableId="30EF492B"/>
 </w16cid:commentsIds>
 </file>
 
@@ -10064,7 +10650,6 @@
   <w:style w:type="character" w:default="1" w:styleId="DefaultParagraphFont">
     <w:name w:val="Default Paragraph Font"/>
     <w:uiPriority w:val="1"/>
-    <w:semiHidden/>
     <w:unhideWhenUsed/>
   </w:style>
   <w:style w:type="table" w:default="1" w:styleId="TableNormal">
@@ -10652,6 +11237,21 @@
       <w:szCs w:val="20"/>
     </w:rPr>
   </w:style>
+  <w:style w:type="paragraph" w:styleId="Bibliography">
+    <w:name w:val="Bibliography"/>
+    <w:basedOn w:val="Normal"/>
+    <w:next w:val="Normal"/>
+    <w:uiPriority w:val="37"/>
+    <w:unhideWhenUsed/>
+    <w:rsid w:val="004B088F"/>
+    <w:pPr>
+      <w:tabs>
+        <w:tab w:val="left" w:pos="264"/>
+      </w:tabs>
+      <w:spacing w:after="240" w:line="240" w:lineRule="auto"/>
+      <w:ind w:left="264" w:hanging="264"/>
+    </w:pPr>
+  </w:style>
 </w:styles>
 </file>
 

</xml_diff>